<commit_message>
NH1 Property Taxes Lege Brief polish: single-bold spotlight bullets (exporter renders one bold lead per bullet), footer tab fix for the longer label (page number on one line); scans re-pass; 8pp verified
Co-authored-by: CaptainWrechols <CaptainWrechols@users.noreply.github.com>
</commit_message>
<xml_diff>
--- a/briefs/new-hampshire/property-taxes/citizen-v2/NH1-Property-Taxes-Lege-Brief.docx
+++ b/briefs/new-hampshire/property-taxes/citizen-v2/NH1-Property-Taxes-Lege-Brief.docx
@@ -1647,17 +1647,17 @@
           <w:szCs w:val="20"/>
           <w:rtl w:val="0"/>
         </w:rPr>
-        <w:t xml:space="preserve">HB1492 (2024) </w:t>
-      </w:r>
-      <w:r>
-        <w:rPr>
-          <w:rFonts w:ascii="Arial" w:cs="Arial" w:eastAsia="Arial" w:hAnsi="Arial"/>
-          <w:color w:val="444444"/>
-          <w:sz w:val="20"/>
-          <w:szCs w:val="20"/>
-          <w:rtl w:val="0"/>
-        </w:rPr>
-        <w:t xml:space="preserve">and **HB100 (2024):** adjustment and faster-repeal bills; both ended in interim study.</w:t>
+        <w:t xml:space="preserve">HB1492 (2024) and HB100 (2024): </w:t>
+      </w:r>
+      <w:r>
+        <w:rPr>
+          <w:rFonts w:ascii="Arial" w:cs="Arial" w:eastAsia="Arial" w:hAnsi="Arial"/>
+          <w:color w:val="444444"/>
+          <w:sz w:val="20"/>
+          <w:szCs w:val="20"/>
+          <w:rtl w:val="0"/>
+        </w:rPr>
+        <w:t xml:space="preserve">adjustment and faster-repeal bills; both ended in interim study.</w:t>
       </w:r>
     </w:p>
     <w:p>
@@ -2301,17 +2301,17 @@
           <w:szCs w:val="20"/>
           <w:rtl w:val="0"/>
         </w:rPr>
-        <w:t xml:space="preserve">HB722 (2020) </w:t>
-      </w:r>
-      <w:r>
-        <w:rPr>
-          <w:rFonts w:ascii="Arial" w:cs="Arial" w:eastAsia="Arial" w:hAnsi="Arial"/>
-          <w:color w:val="444444"/>
-          <w:sz w:val="20"/>
-          <w:szCs w:val="20"/>
-          <w:rtl w:val="0"/>
-        </w:rPr>
-        <w:t xml:space="preserve">and **SB485 (2026):** marijuana and hemp taxation; interim study.</w:t>
+        <w:t xml:space="preserve">HB722 (2020) and SB485 (2026): </w:t>
+      </w:r>
+      <w:r>
+        <w:rPr>
+          <w:rFonts w:ascii="Arial" w:cs="Arial" w:eastAsia="Arial" w:hAnsi="Arial"/>
+          <w:color w:val="444444"/>
+          <w:sz w:val="20"/>
+          <w:szCs w:val="20"/>
+          <w:rtl w:val="0"/>
+        </w:rPr>
+        <w:t xml:space="preserve">marijuana and hemp taxation; interim study.</w:t>
       </w:r>
     </w:p>
     <w:p>
@@ -2568,17 +2568,17 @@
           <w:szCs w:val="20"/>
           <w:rtl w:val="0"/>
         </w:rPr>
-        <w:t xml:space="preserve">HB623 (2020) </w:t>
-      </w:r>
-      <w:r>
-        <w:rPr>
-          <w:rFonts w:ascii="Arial" w:cs="Arial" w:eastAsia="Arial" w:hAnsi="Arial"/>
-          <w:color w:val="444444"/>
-          <w:sz w:val="20"/>
-          <w:szCs w:val="20"/>
-          <w:rtl w:val="0"/>
-        </w:rPr>
-        <w:t xml:space="preserve">and **HB10 (2021–22):** rate restorations; killed in the House.</w:t>
+        <w:t xml:space="preserve">HB623 (2020) and HB10 (2021–22): </w:t>
+      </w:r>
+      <w:r>
+        <w:rPr>
+          <w:rFonts w:ascii="Arial" w:cs="Arial" w:eastAsia="Arial" w:hAnsi="Arial"/>
+          <w:color w:val="444444"/>
+          <w:sz w:val="20"/>
+          <w:szCs w:val="20"/>
+          <w:rtl w:val="0"/>
+        </w:rPr>
+        <w:t xml:space="preserve">rate restorations; killed in the House.</w:t>
       </w:r>
     </w:p>
     <w:p>
@@ -3009,17 +3009,17 @@
           <w:szCs w:val="20"/>
           <w:rtl w:val="0"/>
         </w:rPr>
-        <w:t xml:space="preserve">HB1034 (2024) </w:t>
-      </w:r>
-      <w:r>
-        <w:rPr>
-          <w:rFonts w:ascii="Arial" w:cs="Arial" w:eastAsia="Arial" w:hAnsi="Arial"/>
-          <w:color w:val="444444"/>
-          <w:sz w:val="20"/>
-          <w:szCs w:val="20"/>
-          <w:rtl w:val="0"/>
-        </w:rPr>
-        <w:t xml:space="preserve">and **HB1648 (2026):** the same design refiled; interim study both times.</w:t>
+        <w:t xml:space="preserve">HB1034 (2024) and HB1648 (2026): </w:t>
+      </w:r>
+      <w:r>
+        <w:rPr>
+          <w:rFonts w:ascii="Arial" w:cs="Arial" w:eastAsia="Arial" w:hAnsi="Arial"/>
+          <w:color w:val="444444"/>
+          <w:sz w:val="20"/>
+          <w:szCs w:val="20"/>
+          <w:rtl w:val="0"/>
+        </w:rPr>
+        <w:t xml:space="preserve">the same design refiled; interim study both times.</w:t>
       </w:r>
     </w:p>
     <w:p>
@@ -3126,17 +3126,17 @@
           <w:szCs w:val="20"/>
           <w:rtl w:val="0"/>
         </w:rPr>
-        <w:t xml:space="preserve">HB1365 (2022) </w:t>
-      </w:r>
-      <w:r>
-        <w:rPr>
-          <w:rFonts w:ascii="Arial" w:cs="Arial" w:eastAsia="Arial" w:hAnsi="Arial"/>
-          <w:color w:val="444444"/>
-          <w:sz w:val="20"/>
-          <w:szCs w:val="20"/>
-          <w:rtl w:val="0"/>
-        </w:rPr>
-        <w:t xml:space="preserve">and **HB1467 (2020):** different rates for residential and other property; both killed.</w:t>
+        <w:t xml:space="preserve">HB1365 (2022) and HB1467 (2020): </w:t>
+      </w:r>
+      <w:r>
+        <w:rPr>
+          <w:rFonts w:ascii="Arial" w:cs="Arial" w:eastAsia="Arial" w:hAnsi="Arial"/>
+          <w:color w:val="444444"/>
+          <w:sz w:val="20"/>
+          <w:szCs w:val="20"/>
+          <w:rtl w:val="0"/>
+        </w:rPr>
+        <w:t xml:space="preserve">different rates for residential and other property; both killed.</w:t>
       </w:r>
     </w:p>
     <w:p>
@@ -3297,17 +3297,17 @@
           <w:szCs w:val="20"/>
           <w:rtl w:val="0"/>
         </w:rPr>
-        <w:t xml:space="preserve">HB530 (2023) </w:t>
-      </w:r>
-      <w:r>
-        <w:rPr>
-          <w:rFonts w:ascii="Arial" w:cs="Arial" w:eastAsia="Arial" w:hAnsi="Arial"/>
-          <w:color w:val="444444"/>
-          <w:sz w:val="20"/>
-          <w:szCs w:val="20"/>
-          <w:rtl w:val="0"/>
-        </w:rPr>
-        <w:t xml:space="preserve">and **HB1374 (2026):** withdrawal-from-cooperative procedures; HB1374 passed the House 179–161 on its conference report.</w:t>
+        <w:t xml:space="preserve">HB530 (2023) and HB1374 (2026): </w:t>
+      </w:r>
+      <w:r>
+        <w:rPr>
+          <w:rFonts w:ascii="Arial" w:cs="Arial" w:eastAsia="Arial" w:hAnsi="Arial"/>
+          <w:color w:val="444444"/>
+          <w:sz w:val="20"/>
+          <w:szCs w:val="20"/>
+          <w:rtl w:val="0"/>
+        </w:rPr>
+        <w:t xml:space="preserve">withdrawal-from-cooperative procedures; HB1374 passed the House 179–161 on its conference report.</w:t>
       </w:r>
     </w:p>
     <w:p>
@@ -4581,7 +4581,7 @@
           <w:szCs w:val="20"/>
           <w:rtl w:val="0"/>
         </w:rPr>
-        <w:t xml:space="preserve"> Taxing owner-occupied primary homes on less than full value — a local option in every version filed here. Distinct from the existing **homestead right**, which protects home equity from creditors and has nothing to do with taxes.</w:t>
+        <w:t xml:space="preserve"> Taxing owner-occupied primary homes on less than full value — a local option in every version filed here. Distinct from the existing homestead right, which protects home equity from creditors and has nothing to do with taxes.</w:t>
       </w:r>
     </w:p>
     <w:p>
@@ -5700,8 +5700,6 @@
         <w:rtl w:val="0"/>
       </w:rPr>
       <w:t xml:space="preserve">NH1 Property Taxes Legislative Brief v1.0</w:t>
-      <w:tab/>
-      <w:tab/>
       <w:tab/>
       <w:tab/>
       <w:tab/>

</xml_diff>

<commit_message>
Current-biennium certification: identical wide net swept all 2,234 bills in the 2025-2026 SQL universe; 31 real misses added (incl. missed laws HB138 tax-impact notation + SB105 town budget caps; HB284 passed-House transparency bill; SAU-consolidation bills HB765/HB1804; occupancy-fee refiles; CACR10/CACR12), 86 exclusions categorized; set 561 bills / 476 policy / 101 laws; brief, reality map, appendices, masters rebuilt; all fact-checks re-pass
Co-authored-by: CaptainWrechols <CaptainWrechols@users.noreply.github.com>
</commit_message>
<xml_diff>
--- a/briefs/new-hampshire/property-taxes/citizen-v2/NH1-Property-Taxes-Lege-Brief.docx
+++ b/briefs/new-hampshire/property-taxes/citizen-v2/NH1-Property-Taxes-Lege-Brief.docx
@@ -67,7 +67,7 @@
           <w:szCs w:val="20"/>
           <w:rtl w:val="0"/>
         </w:rPr>
-        <w:t xml:space="preserve">New Hampshire's General Court took up 445 property-tax and revenue bills across the 2020–2026 sessions, and 96 became law. The record has a clear shape: relief for specific groups — veterans, the elderly, charities — passes regularly; every attempt to restore a state tax that was cut, or to add a new one, dies in the House; and the changes that actually moved money — the business tax cuts, the interest-and-dividends repeal, the school funding formulas, the end of revenue sharing — were made inside HB2, the budget trailer, on votes cast only on the whole bill.</w:t>
+        <w:t xml:space="preserve">New Hampshire's General Court took up 476 property-tax and revenue bills across the 2020–2026 sessions, and 101 became law. The record has a clear shape: relief for specific groups — veterans, the elderly, charities — passes regularly; every attempt to restore a state tax that was cut, or to add a new one, dies in the House; and the changes that actually moved money — the business tax cuts, the interest-and-dividends repeal, the school funding formulas, the end of revenue sharing — were made inside HB2, the budget trailer, on votes cast only on the whole bill.</w:t>
       </w:r>
     </w:p>
     <w:tbl>
@@ -127,7 +127,7 @@
                 <w:szCs w:val="36"/>
                 <w:rtl w:val="0"/>
               </w:rPr>
-              <w:t xml:space="preserve">445</w:t>
+              <w:t xml:space="preserve">476</w:t>
             </w:r>
             <w:r>
               <w:rPr>
@@ -187,7 +187,7 @@
                 <w:szCs w:val="36"/>
                 <w:rtl w:val="0"/>
               </w:rPr>
-              <w:t xml:space="preserve">96</w:t>
+              <w:t xml:space="preserve">101</w:t>
             </w:r>
             <w:r>
               <w:rPr>
@@ -307,7 +307,7 @@
                 <w:szCs w:val="28"/>
                 <w:rtl w:val="0"/>
               </w:rPr>
-              <w:t xml:space="preserve">2 of 6</w:t>
+              <w:t xml:space="preserve">1 of 6</w:t>
             </w:r>
             <w:r>
               <w:rPr>
@@ -680,7 +680,29 @@
           <w:szCs w:val="20"/>
           <w:rtl w:val="0"/>
         </w:rPr>
-        <w:t xml:space="preserve">, the tax-cap compliance bill.</w:t>
+        <w:t xml:space="preserve">, the tax-cap compliance bill, and </w:t>
+      </w:r>
+      <w:r>
+        <w:rPr>
+          <w:rFonts w:ascii="Arial" w:cs="Arial" w:eastAsia="Arial" w:hAnsi="Arial"/>
+          <w:b w:val="1"/>
+          <w:bCs w:val="1"/>
+          <w:color w:val="1a2d4f"/>
+          <w:sz w:val="20"/>
+          <w:szCs w:val="20"/>
+          <w:rtl w:val="0"/>
+        </w:rPr>
+        <w:t xml:space="preserve">HB421 (2025)</w:t>
+      </w:r>
+      <w:r>
+        <w:rPr>
+          <w:rFonts w:ascii="Arial" w:cs="Arial" w:eastAsia="Arial" w:hAnsi="Arial"/>
+          <w:color w:val="444444"/>
+          <w:sz w:val="20"/>
+          <w:szCs w:val="20"/>
+          <w:rtl w:val="0"/>
+        </w:rPr>
+        <w:t xml:space="preserve">, the exempt-status notice bill, which died in a conference committee that never agreed.</w:t>
       </w:r>
     </w:p>
     <w:p>
@@ -828,7 +850,7 @@
           <w:szCs w:val="20"/>
           <w:rtl w:val="0"/>
         </w:rPr>
-        <w:t xml:space="preserve"> The income-tax ban (CACR1, 2021) won a House majority 202–171 and the sales-tax ban (CACR2, 2021) won 201–170 — both short of the three-fifths a constitutional amendment needs. CACR15 (2024), requiring a two-thirds vote for new taxes, failed 183–185.</w:t>
+        <w:t xml:space="preserve"> The income-tax ban (CACR1, 2021) won a House majority 202–171 and the sales-tax ban (CACR2, 2021) won 201–170 — both short of the three-fifths a constitutional amendment needs. CACR15 (2024), requiring a two-thirds vote for new taxes, failed 183–185; the 2026 tax-law-adoption amendments repeated the pattern — CACR10 at 194–158, and CACR12 at 193–148 after passing the Senate 16–8.</w:t>
       </w:r>
     </w:p>
     <w:p>
@@ -878,7 +900,29 @@
           <w:szCs w:val="20"/>
           <w:rtl w:val="0"/>
         </w:rPr>
-        <w:t xml:space="preserve"> passed the House 174–113 and died on the Senate table; refilings died in 2022, 2023, and 2024. </w:t>
+        <w:t xml:space="preserve"> passed the House 174–113 and died on the Senate table; refilings died in 2022, 2023, 2024, 2025, and 2026 — the last (SB634) killed 15–9 on the Senate floor. </w:t>
+      </w:r>
+      <w:r>
+        <w:rPr>
+          <w:rFonts w:ascii="Arial" w:cs="Arial" w:eastAsia="Arial" w:hAnsi="Arial"/>
+          <w:b w:val="1"/>
+          <w:bCs w:val="1"/>
+          <w:color w:val="1a2d4f"/>
+          <w:sz w:val="20"/>
+          <w:szCs w:val="20"/>
+          <w:rtl w:val="0"/>
+        </w:rPr>
+        <w:t xml:space="preserve">Tax-impact statements on warrant articles — HB284 (2025)</w:t>
+      </w:r>
+      <w:r>
+        <w:rPr>
+          <w:rFonts w:ascii="Arial" w:cs="Arial" w:eastAsia="Arial" w:hAnsi="Arial"/>
+          <w:color w:val="444444"/>
+          <w:sz w:val="20"/>
+          <w:szCs w:val="20"/>
+          <w:rtl w:val="0"/>
+        </w:rPr>
+        <w:t xml:space="preserve"> passed the House 198–160 and was killed on the Senate floor; its twin HB138 became law the same year. </w:t>
       </w:r>
       <w:r>
         <w:rPr>
@@ -970,7 +1014,7 @@
           <w:szCs w:val="20"/>
           <w:rtl w:val="0"/>
         </w:rPr>
-        <w:t xml:space="preserve">Twenty-seven tax and revenue laws in two years. Relief for specific groups kept passing: the disabled-veterans waiver (HB99), higher optional veterans' and surviving-spouse credits (HB1494), prior-year charitable exemptions (HB426), the religious-use exemption clarified (SB291), and one-time exemption filing (HB1756). SB83 built something new: a state fund that reimburses towns for the elderly, disabled, blind, and deaf exemptions — financed by the video lottery terminals the budget trailer legalized. Tax caps advanced every year: override procedures (HB200), a full cap-law rewrite (HB374), and school-district cap questions placed on the 2026 and 2028 state ballots (HB1300). Transparency finally scored: HB1807 puts tax-rate and tax-impact information on warrant articles, and SB600 requires quarterly public reports on the general and education trust funds. HB696 settled how utility property taxes and the statewide education property tax apply to power plants, and gaming kept spreading — statewide keno and local games of chance (HB737), longer keno hours (HB591).</w:t>
+        <w:t xml:space="preserve">Thirty-two tax and revenue laws in two years. Relief for specific groups kept passing: the disabled-veterans waiver (HB99), higher optional veterans' and surviving-spouse credits (HB1494), prior-year charitable exemptions (HB426), the religious-use exemption clarified (SB291), and one-time exemption filing (HB1756). SB83 built something new: a state fund that reimburses towns for the elderly, disabled, blind, and deaf exemptions — financed by the video lottery terminals the budget trailer legalized. Tax caps advanced every year: town budget caps (SB105), override procedures (HB200), a full cap-law rewrite (HB374), and school-district cap questions placed on the 2026 and 2028 state ballots (HB1300). Transparency finally scored: HB138 (2025) put multi-year tax-impact notation on warrant articles, HB1807 (2026) extended it to tax-rate and tax-impact information generally, and SB600 requires quarterly public reports on the general and education trust funds. HB696 settled how utility property taxes and the statewide education property tax apply to power plants, and gaming kept spreading — statewide keno and local games of chance (HB737), longer keno hours (HB591).</w:t>
       </w:r>
     </w:p>
     <w:p>
@@ -1040,7 +1084,7 @@
           <w:szCs w:val="20"/>
           <w:rtl w:val="0"/>
         </w:rPr>
-        <w:t xml:space="preserve">Two of the six citizen proposals have never been filed; the rest of the untraveled ground stops early, almost always in the House.</w:t>
+        <w:t xml:space="preserve">One of the six citizen proposals has never been filed in any form; the rest of the untraveled ground stops early, almost always in the House.</w:t>
       </w:r>
     </w:p>
     <w:p>
@@ -1086,17 +1130,17 @@
           <w:szCs w:val="20"/>
           <w:rtl w:val="0"/>
         </w:rPr>
-        <w:t xml:space="preserve">Consolidation incentives. Never filed.</w:t>
-      </w:r>
-      <w:r>
-        <w:rPr>
-          <w:rFonts w:ascii="Arial" w:cs="Arial" w:eastAsia="Arial" w:hAnsi="Arial"/>
-          <w:color w:val="444444"/>
-          <w:sz w:val="20"/>
-          <w:szCs w:val="20"/>
-          <w:rtl w:val="0"/>
-        </w:rPr>
-        <w:t xml:space="preserve"> No bill proposes state incentives for towns or districts to regionalize services. The active legislation runs the other way: easier withdrawal from cooperative school districts (HB530 2023; HB1374 2026), Derry absorbing its district (HB1331, 2026), unilateral-withdrawal study (HB1644, 2026).</w:t>
+        <w:t xml:space="preserve">Consolidation incentives. Never filed — and the mandates failed.</w:t>
+      </w:r>
+      <w:r>
+        <w:rPr>
+          <w:rFonts w:ascii="Arial" w:cs="Arial" w:eastAsia="Arial" w:hAnsi="Arial"/>
+          <w:color w:val="444444"/>
+          <w:sz w:val="20"/>
+          <w:szCs w:val="20"/>
+          <w:rtl w:val="0"/>
+        </w:rPr>
+        <w:t xml:space="preserve"> No bill proposes state incentives for towns or districts to regionalize services. Mandatory consolidation of school administrative units was filed and failed twice: HB765 (2025) died on a unanimous 18–0 Inexpedient to Legislate committee report, its refile HB1804 (2026) sits in interim study, and the school-building consolidation planning bill (HB1818, 2026) died on the Senate table. The rest of the active legislation runs the other way: easier withdrawal from cooperative school districts (HB530 2023; HB1374 2026), Derry absorbing its district (HB1331, 2026), unilateral-withdrawal study (HB1644, 2026).</w:t>
       </w:r>
     </w:p>
     <w:p>
@@ -1124,7 +1168,7 @@
           <w:szCs w:val="20"/>
           <w:rtl w:val="0"/>
         </w:rPr>
-        <w:t xml:space="preserve"> Every new-tax bill died fast: the electronics tax 320–11 (HB1492, 2020), the vacancy tax (HB1707, 2026), the luxury second-home assessment tabled 189–158 with the rescue motion failing 100–235 (HB1786, 2026). Even studying revenue options was killed on the floor twice in 2026 — the Department of Revenue Administration study 284–76 (HB1636) and the education-funding alternatives study 195–157 (HB491). Marijuana taxation (HB722, 2020) and hemp taxation (SB485, 2026) sit in interim study.</w:t>
+        <w:t xml:space="preserve"> Every new-tax bill died fast: the electronics tax 320–11 (HB1492, 2020), the vacancy tax (HB1707, 2026), the luxury second-home assessment tabled 189–158 with the rescue motion failing 100–235 (HB1786, 2026). Even studying revenue options was killed on the floor twice in 2026 — the Department of Revenue Administration study 284–76 (HB1636) and the education-funding alternatives study 195–157 (HB491). Marijuana taxation (HB722, 2020) and hemp taxation (SB485, 2026) sit in interim study, and both tobacco-tax raises died in the House (HB290, 2025; HB1596, 2026, killed 200–157).</w:t>
       </w:r>
     </w:p>
     <w:p>
@@ -1180,7 +1224,7 @@
           <w:szCs w:val="20"/>
           <w:rtl w:val="0"/>
         </w:rPr>
-        <w:t xml:space="preserve"> The enabling bill — letting towns tax owner-occupied homes on less than full value — was killed in 2022 (HB1387) and sent to interim study in 2024 (HB1034) and again in 2026 (HB1648). Taxing non-primary residences more was killed 284–55 (HB1580, 2026); the split-rate design died in 2020 (HB1467) and 2022 (HB1365).</w:t>
+        <w:t xml:space="preserve"> The enabling bill — letting towns tax owner-occupied homes on less than full value — was killed in 2022 (HB1387) and sent to interim study in 2024 (HB1034) and again in 2026 (HB1648). Taxing non-primary residences more was killed 284–55 (HB1580, 2026); the split-rate design died in 2020 (HB1467) and 2022 (HB1365), and the deeper structural alternatives — the municipal land value tax (HB1417, 2026) and cost-based assessment (HB1380, 2026) — died on the House floor.</w:t>
       </w:r>
     </w:p>
     <w:p>
@@ -1226,7 +1270,7 @@
           <w:szCs w:val="20"/>
           <w:rtl w:val="0"/>
         </w:rPr>
-        <w:t xml:space="preserve"> group-specific relief (a veterans, elderly, or charity law nearly every session, and SB83's reimbursement fund in 2025); tax caps (four laws in the 2025–2026 biennium); gaming revenue (a new expansion every biennium since 2021); tax transparency (two 2026 laws after five years of dead bills); and the school-aid formulas (rebuilt toward property-poor towns in 2022, 2023, and 2025 — always through the budget). </w:t>
+        <w:t xml:space="preserve"> group-specific relief (a veterans, elderly, or charity law nearly every session, and SB83's reimbursement fund in 2025); tax caps (four laws in the 2025–2026 biennium); gaming revenue (a new expansion every biennium since 2021); tax transparency (laws in both 2025 and 2026 after five years of dead bills); and the school-aid formulas (rebuilt toward property-poor towns in 2022, 2023, and 2025 — always through the budget). </w:t>
       </w:r>
       <w:r>
         <w:rPr>
@@ -1276,7 +1320,7 @@
           <w:szCs w:val="20"/>
           <w:rtl w:val="0"/>
         </w:rPr>
-        <w:t xml:space="preserve"> The House floor's Inexpedient to Legislate motion is the record's great filter — 285 of the 445 policy bills ended killed, most of them there — and the Senate's table and Rule 3-23 deadline quietly ended municipal-aid bills that had passed 23–0 or 24–0. Some decisive outcomes left no roll call at all: SB63's passage before its veto, most committee kills, and dozens of consent-calendar deaths. Constitutional amendments face the extra three-fifths wall: majorities of 202–171 and 201–170 still failed. Party labels exist only for 2025–2026 sponsors in this record, where cross-party sponsor teams appear on 40 policy bills; the most frequent prime sponsors where records exist are in Appendix D.</w:t>
+        <w:t xml:space="preserve"> The House floor's Inexpedient to Legislate motion is the record's great filter — 306 of the 476 policy bills ended killed, most of them there — and the Senate's table and Rule 3-23 deadline quietly ended municipal-aid bills that had passed 23–0 or 24–0. Some decisive outcomes left no roll call at all: SB63's passage before its veto, most committee kills, and dozens of consent-calendar deaths. Constitutional amendments face the extra three-fifths wall: majorities of 202–171 and 201–170 still failed. Party labels exist only for 2025–2026 sponsors in this record, where cross-party sponsor teams appear on 40 policy bills; the most frequent prime sponsors where records exist are in Appendix D.</w:t>
       </w:r>
     </w:p>
     <w:p>
@@ -2103,6 +2147,45 @@
     </w:p>
     <w:p>
       <w:pPr>
+        <w:spacing w:after="80"/>
+        <w:ind w:left="200" w:firstLine="0"/>
+        <w:rPr/>
+      </w:pPr>
+      <w:r>
+        <w:rPr>
+          <w:rFonts w:ascii="Arial" w:cs="Arial" w:eastAsia="Arial" w:hAnsi="Arial"/>
+          <w:color w:val="c0392b"/>
+          <w:sz w:val="20"/>
+          <w:szCs w:val="20"/>
+          <w:rtl w:val="0"/>
+        </w:rPr>
+        <w:t xml:space="preserve">▪  </w:t>
+      </w:r>
+      <w:r>
+        <w:rPr>
+          <w:rFonts w:ascii="Arial" w:cs="Arial" w:eastAsia="Arial" w:hAnsi="Arial"/>
+          <w:b w:val="1"/>
+          <w:bCs w:val="1"/>
+          <w:color w:val="1a2d4f"/>
+          <w:sz w:val="20"/>
+          <w:szCs w:val="20"/>
+          <w:rtl w:val="0"/>
+        </w:rPr>
+        <w:t xml:space="preserve">CACR10 and CACR12 (2026): </w:t>
+      </w:r>
+      <w:r>
+        <w:rPr>
+          <w:rFonts w:ascii="Arial" w:cs="Arial" w:eastAsia="Arial" w:hAnsi="Arial"/>
+          <w:color w:val="444444"/>
+          <w:sz w:val="20"/>
+          <w:szCs w:val="20"/>
+          <w:rtl w:val="0"/>
+        </w:rPr>
+        <w:t xml:space="preserve">the tax-law-adoption amendments; 194–158 and 193–148 in the House (CACR12 had passed the Senate 16–8), also short of three-fifths.</w:t>
+      </w:r>
+    </w:p>
+    <w:p>
+      <w:pPr>
         <w:spacing w:before="70" w:after="30" w:line="250" w:lineRule="auto"/>
         <w:rPr/>
       </w:pPr>
@@ -2355,6 +2438,45 @@
     </w:p>
     <w:p>
       <w:pPr>
+        <w:spacing w:after="80"/>
+        <w:ind w:left="200" w:firstLine="0"/>
+        <w:rPr/>
+      </w:pPr>
+      <w:r>
+        <w:rPr>
+          <w:rFonts w:ascii="Arial" w:cs="Arial" w:eastAsia="Arial" w:hAnsi="Arial"/>
+          <w:color w:val="c0392b"/>
+          <w:sz w:val="20"/>
+          <w:szCs w:val="20"/>
+          <w:rtl w:val="0"/>
+        </w:rPr>
+        <w:t xml:space="preserve">▪  </w:t>
+      </w:r>
+      <w:r>
+        <w:rPr>
+          <w:rFonts w:ascii="Arial" w:cs="Arial" w:eastAsia="Arial" w:hAnsi="Arial"/>
+          <w:b w:val="1"/>
+          <w:bCs w:val="1"/>
+          <w:color w:val="1a2d4f"/>
+          <w:sz w:val="20"/>
+          <w:szCs w:val="20"/>
+          <w:rtl w:val="0"/>
+        </w:rPr>
+        <w:t xml:space="preserve">HB290 (2025) and HB1596 (2026): </w:t>
+      </w:r>
+      <w:r>
+        <w:rPr>
+          <w:rFonts w:ascii="Arial" w:cs="Arial" w:eastAsia="Arial" w:hAnsi="Arial"/>
+          <w:color w:val="444444"/>
+          <w:sz w:val="20"/>
+          <w:szCs w:val="20"/>
+          <w:rtl w:val="0"/>
+        </w:rPr>
+        <w:t xml:space="preserve">the cigarette and tobacco tax raises; killed in the House, the second 200–157.</w:t>
+      </w:r>
+    </w:p>
+    <w:p>
+      <w:pPr>
         <w:spacing w:before="84" w:after="36" w:line="254" w:lineRule="auto"/>
         <w:rPr/>
       </w:pPr>
@@ -3165,6 +3287,45 @@
           <w:szCs w:val="20"/>
           <w:rtl w:val="0"/>
         </w:rPr>
+        <w:t xml:space="preserve">HB1417 and HB1380 (2026): </w:t>
+      </w:r>
+      <w:r>
+        <w:rPr>
+          <w:rFonts w:ascii="Arial" w:cs="Arial" w:eastAsia="Arial" w:hAnsi="Arial"/>
+          <w:color w:val="444444"/>
+          <w:sz w:val="20"/>
+          <w:szCs w:val="20"/>
+          <w:rtl w:val="0"/>
+        </w:rPr>
+        <w:t xml:space="preserve">the municipal land value tax and cost-based assessment — the structural alternatives; both killed.</w:t>
+      </w:r>
+    </w:p>
+    <w:p>
+      <w:pPr>
+        <w:spacing w:after="80"/>
+        <w:ind w:left="200" w:firstLine="0"/>
+        <w:rPr/>
+      </w:pPr>
+      <w:r>
+        <w:rPr>
+          <w:rFonts w:ascii="Arial" w:cs="Arial" w:eastAsia="Arial" w:hAnsi="Arial"/>
+          <w:color w:val="c0392b"/>
+          <w:sz w:val="20"/>
+          <w:szCs w:val="20"/>
+          <w:rtl w:val="0"/>
+        </w:rPr>
+        <w:t xml:space="preserve">▪  </w:t>
+      </w:r>
+      <w:r>
+        <w:rPr>
+          <w:rFonts w:ascii="Arial" w:cs="Arial" w:eastAsia="Arial" w:hAnsi="Arial"/>
+          <w:b w:val="1"/>
+          <w:bCs w:val="1"/>
+          <w:color w:val="1a2d4f"/>
+          <w:sz w:val="20"/>
+          <w:szCs w:val="20"/>
+          <w:rtl w:val="0"/>
+        </w:rPr>
         <w:t xml:space="preserve">HB101, HB766, HB782 (2025): </w:t>
       </w:r>
       <w:r>
@@ -3211,7 +3372,7 @@
           <w:szCs w:val="20"/>
           <w:rtl w:val="0"/>
         </w:rPr>
-        <w:t xml:space="preserve">Never filed as proposed: no bill offers incentives to consolidate. The legislature's energy flows the opposite way — toward easier separation from cooperative school districts.</w:t>
+        <w:t xml:space="preserve">Incentives to consolidate have never been filed; mandatory consolidation of school administrative units was filed twice and failed. Most of the legislature's energy flows the opposite way — toward easier separation from cooperative school districts.</w:t>
       </w:r>
     </w:p>
     <w:p>
@@ -3393,6 +3554,123 @@
           <w:szCs w:val="20"/>
           <w:rtl w:val="0"/>
         </w:rPr>
+        <w:t xml:space="preserve">HB765 (2025): </w:t>
+      </w:r>
+      <w:r>
+        <w:rPr>
+          <w:rFonts w:ascii="Arial" w:cs="Arial" w:eastAsia="Arial" w:hAnsi="Arial"/>
+          <w:color w:val="444444"/>
+          <w:sz w:val="20"/>
+          <w:szCs w:val="20"/>
+          <w:rtl w:val="0"/>
+        </w:rPr>
+        <w:t xml:space="preserve">consolidating school administrative units with elected superintendents; a unanimous 18–0 Inexpedient to Legislate committee report, killed by voice vote.</w:t>
+      </w:r>
+    </w:p>
+    <w:p>
+      <w:pPr>
+        <w:spacing w:after="80"/>
+        <w:ind w:left="200" w:firstLine="0"/>
+        <w:rPr/>
+      </w:pPr>
+      <w:r>
+        <w:rPr>
+          <w:rFonts w:ascii="Arial" w:cs="Arial" w:eastAsia="Arial" w:hAnsi="Arial"/>
+          <w:color w:val="c0392b"/>
+          <w:sz w:val="20"/>
+          <w:szCs w:val="20"/>
+          <w:rtl w:val="0"/>
+        </w:rPr>
+        <w:t xml:space="preserve">▪  </w:t>
+      </w:r>
+      <w:r>
+        <w:rPr>
+          <w:rFonts w:ascii="Arial" w:cs="Arial" w:eastAsia="Arial" w:hAnsi="Arial"/>
+          <w:b w:val="1"/>
+          <w:bCs w:val="1"/>
+          <w:color w:val="1a2d4f"/>
+          <w:sz w:val="20"/>
+          <w:szCs w:val="20"/>
+          <w:rtl w:val="0"/>
+        </w:rPr>
+        <w:t xml:space="preserve">HB1804 (2026): </w:t>
+      </w:r>
+      <w:r>
+        <w:rPr>
+          <w:rFonts w:ascii="Arial" w:cs="Arial" w:eastAsia="Arial" w:hAnsi="Arial"/>
+          <w:color w:val="444444"/>
+          <w:sz w:val="20"/>
+          <w:szCs w:val="20"/>
+          <w:rtl w:val="0"/>
+        </w:rPr>
+        <w:t xml:space="preserve">the same consolidation refiled; interim study.</w:t>
+      </w:r>
+    </w:p>
+    <w:p>
+      <w:pPr>
+        <w:spacing w:after="80"/>
+        <w:ind w:left="200" w:firstLine="0"/>
+        <w:rPr/>
+      </w:pPr>
+      <w:r>
+        <w:rPr>
+          <w:rFonts w:ascii="Arial" w:cs="Arial" w:eastAsia="Arial" w:hAnsi="Arial"/>
+          <w:color w:val="c0392b"/>
+          <w:sz w:val="20"/>
+          <w:szCs w:val="20"/>
+          <w:rtl w:val="0"/>
+        </w:rPr>
+        <w:t xml:space="preserve">▪  </w:t>
+      </w:r>
+      <w:r>
+        <w:rPr>
+          <w:rFonts w:ascii="Arial" w:cs="Arial" w:eastAsia="Arial" w:hAnsi="Arial"/>
+          <w:b w:val="1"/>
+          <w:bCs w:val="1"/>
+          <w:color w:val="1a2d4f"/>
+          <w:sz w:val="20"/>
+          <w:szCs w:val="20"/>
+          <w:rtl w:val="0"/>
+        </w:rPr>
+        <w:t xml:space="preserve">HB1818 (2026): </w:t>
+      </w:r>
+      <w:r>
+        <w:rPr>
+          <w:rFonts w:ascii="Arial" w:cs="Arial" w:eastAsia="Arial" w:hAnsi="Arial"/>
+          <w:color w:val="444444"/>
+          <w:sz w:val="20"/>
+          <w:szCs w:val="20"/>
+          <w:rtl w:val="0"/>
+        </w:rPr>
+        <w:t xml:space="preserve">school-building consolidation planning through the education department's 10-year facilities plans; died on the Senate table.</w:t>
+      </w:r>
+    </w:p>
+    <w:p>
+      <w:pPr>
+        <w:spacing w:after="80"/>
+        <w:ind w:left="200" w:firstLine="0"/>
+        <w:rPr/>
+      </w:pPr>
+      <w:r>
+        <w:rPr>
+          <w:rFonts w:ascii="Arial" w:cs="Arial" w:eastAsia="Arial" w:hAnsi="Arial"/>
+          <w:color w:val="c0392b"/>
+          <w:sz w:val="20"/>
+          <w:szCs w:val="20"/>
+          <w:rtl w:val="0"/>
+        </w:rPr>
+        <w:t xml:space="preserve">▪  </w:t>
+      </w:r>
+      <w:r>
+        <w:rPr>
+          <w:rFonts w:ascii="Arial" w:cs="Arial" w:eastAsia="Arial" w:hAnsi="Arial"/>
+          <w:b w:val="1"/>
+          <w:bCs w:val="1"/>
+          <w:color w:val="1a2d4f"/>
+          <w:sz w:val="20"/>
+          <w:szCs w:val="20"/>
+          <w:rtl w:val="0"/>
+        </w:rPr>
         <w:t xml:space="preserve">HB1644 (2026): </w:t>
       </w:r>
       <w:r>
@@ -3499,7 +3777,7 @@
           <w:szCs w:val="20"/>
           <w:rtl w:val="0"/>
         </w:rPr>
-        <w:t xml:space="preserve">State incentives for consolidating municipal or school services, shared-service grants, or a regionalization study — the certified record contains none.</w:t>
+        <w:t xml:space="preserve">State incentives for consolidating municipal or school services, shared-service grants, or a regionalization study — the certified record contains none. (Consolidation mandates were filed — see above — but nothing pays or rewards towns for combining services.)</w:t>
       </w:r>
     </w:p>
     <w:p>
@@ -3535,7 +3813,7 @@
           <w:szCs w:val="20"/>
           <w:rtl w:val="0"/>
         </w:rPr>
-        <w:t xml:space="preserve">The one proposal already adopted as a formal recommendation by participants — and the one where 2026 finally produced laws after five years of dead transparency bills.</w:t>
+        <w:t xml:space="preserve">The one proposal already adopted as a formal recommendation by participants — and the one where the 2025–2026 biennium finally produced laws after five years of dead transparency bills.</w:t>
       </w:r>
     </w:p>
     <w:p>
@@ -3582,6 +3860,45 @@
           <w:szCs w:val="20"/>
           <w:rtl w:val="0"/>
         </w:rPr>
+        <w:t xml:space="preserve">HB138 (2025): </w:t>
+      </w:r>
+      <w:r>
+        <w:rPr>
+          <w:rFonts w:ascii="Arial" w:cs="Arial" w:eastAsia="Arial" w:hAnsi="Arial"/>
+          <w:color w:val="444444"/>
+          <w:sz w:val="20"/>
+          <w:szCs w:val="20"/>
+          <w:rtl w:val="0"/>
+        </w:rPr>
+        <w:t xml:space="preserve">multi-year tax-impact notation required on warrant articles (Chapter 144) — the thread's first win.</w:t>
+      </w:r>
+    </w:p>
+    <w:p>
+      <w:pPr>
+        <w:spacing w:after="80"/>
+        <w:ind w:left="200" w:firstLine="0"/>
+        <w:rPr/>
+      </w:pPr>
+      <w:r>
+        <w:rPr>
+          <w:rFonts w:ascii="Arial" w:cs="Arial" w:eastAsia="Arial" w:hAnsi="Arial"/>
+          <w:color w:val="c0392b"/>
+          <w:sz w:val="20"/>
+          <w:szCs w:val="20"/>
+          <w:rtl w:val="0"/>
+        </w:rPr>
+        <w:t xml:space="preserve">▪  </w:t>
+      </w:r>
+      <w:r>
+        <w:rPr>
+          <w:rFonts w:ascii="Arial" w:cs="Arial" w:eastAsia="Arial" w:hAnsi="Arial"/>
+          <w:b w:val="1"/>
+          <w:bCs w:val="1"/>
+          <w:color w:val="1a2d4f"/>
+          <w:sz w:val="20"/>
+          <w:szCs w:val="20"/>
+          <w:rtl w:val="0"/>
+        </w:rPr>
         <w:t xml:space="preserve">HB1807 (2026): </w:t>
       </w:r>
       <w:r>
@@ -3717,17 +4034,17 @@
           <w:szCs w:val="20"/>
           <w:rtl w:val="0"/>
         </w:rPr>
-        <w:t xml:space="preserve">SB252 (2022): </w:t>
-      </w:r>
-      <w:r>
-        <w:rPr>
-          <w:rFonts w:ascii="Arial" w:cs="Arial" w:eastAsia="Arial" w:hAnsi="Arial"/>
-          <w:color w:val="444444"/>
-          <w:sz w:val="20"/>
-          <w:szCs w:val="20"/>
-          <w:rtl w:val="0"/>
-        </w:rPr>
-        <w:t xml:space="preserve">more information on property tax bills; killed on the Senate floor 13–10.</w:t>
+        <w:t xml:space="preserve">HB284 (2025): </w:t>
+      </w:r>
+      <w:r>
+        <w:rPr>
+          <w:rFonts w:ascii="Arial" w:cs="Arial" w:eastAsia="Arial" w:hAnsi="Arial"/>
+          <w:color w:val="444444"/>
+          <w:sz w:val="20"/>
+          <w:szCs w:val="20"/>
+          <w:rtl w:val="0"/>
+        </w:rPr>
+        <w:t xml:space="preserve">tax impact statements on warrant articles — HB138's twin; passed the House 198–160 and was killed on the Senate floor.</w:t>
       </w:r>
     </w:p>
     <w:p>
@@ -3756,17 +4073,17 @@
           <w:szCs w:val="20"/>
           <w:rtl w:val="0"/>
         </w:rPr>
-        <w:t xml:space="preserve">HB99 (2023): </w:t>
-      </w:r>
-      <w:r>
-        <w:rPr>
-          <w:rFonts w:ascii="Arial" w:cs="Arial" w:eastAsia="Arial" w:hAnsi="Arial"/>
-          <w:color w:val="444444"/>
-          <w:sz w:val="20"/>
-          <w:szCs w:val="20"/>
-          <w:rtl w:val="0"/>
-        </w:rPr>
-        <w:t xml:space="preserve">rebate-program information printed on tax bills; killed in the House.</w:t>
+        <w:t xml:space="preserve">HB495 (2025): </w:t>
+      </w:r>
+      <w:r>
+        <w:rPr>
+          <w:rFonts w:ascii="Arial" w:cs="Arial" w:eastAsia="Arial" w:hAnsi="Arial"/>
+          <w:color w:val="444444"/>
+          <w:sz w:val="20"/>
+          <w:szCs w:val="20"/>
+          <w:rtl w:val="0"/>
+        </w:rPr>
+        <w:t xml:space="preserve">a breakdown of tax changes mailed with residents' bills; killed in the House.</w:t>
       </w:r>
     </w:p>
     <w:p>
@@ -3795,17 +4112,17 @@
           <w:szCs w:val="20"/>
           <w:rtl w:val="0"/>
         </w:rPr>
-        <w:t xml:space="preserve">SB217 (2025): </w:t>
-      </w:r>
-      <w:r>
-        <w:rPr>
-          <w:rFonts w:ascii="Arial" w:cs="Arial" w:eastAsia="Arial" w:hAnsi="Arial"/>
-          <w:color w:val="444444"/>
-          <w:sz w:val="20"/>
-          <w:szCs w:val="20"/>
-          <w:rtl w:val="0"/>
-        </w:rPr>
-        <w:t xml:space="preserve">public notice of historic tax rates and project tax impacts; killed in the House.</w:t>
+        <w:t xml:space="preserve">SB225 (2025): </w:t>
+      </w:r>
+      <w:r>
+        <w:rPr>
+          <w:rFonts w:ascii="Arial" w:cs="Arial" w:eastAsia="Arial" w:hAnsi="Arial"/>
+          <w:color w:val="444444"/>
+          <w:sz w:val="20"/>
+          <w:szCs w:val="20"/>
+          <w:rtl w:val="0"/>
+        </w:rPr>
+        <w:t xml:space="preserve">public notice before local property re-assessments; killed in the House.</w:t>
       </w:r>
     </w:p>
     <w:p>
@@ -3834,17 +4151,17 @@
           <w:szCs w:val="20"/>
           <w:rtl w:val="0"/>
         </w:rPr>
-        <w:t xml:space="preserve">HB782 (2025): </w:t>
-      </w:r>
-      <w:r>
-        <w:rPr>
-          <w:rFonts w:ascii="Arial" w:cs="Arial" w:eastAsia="Arial" w:hAnsi="Arial"/>
-          <w:color w:val="444444"/>
-          <w:sz w:val="20"/>
-          <w:szCs w:val="20"/>
-          <w:rtl w:val="0"/>
-        </w:rPr>
-        <w:t xml:space="preserve">relief-program public awareness (with exemption expansions); killed.</w:t>
+        <w:t xml:space="preserve">SB252 (2022): </w:t>
+      </w:r>
+      <w:r>
+        <w:rPr>
+          <w:rFonts w:ascii="Arial" w:cs="Arial" w:eastAsia="Arial" w:hAnsi="Arial"/>
+          <w:color w:val="444444"/>
+          <w:sz w:val="20"/>
+          <w:szCs w:val="20"/>
+          <w:rtl w:val="0"/>
+        </w:rPr>
+        <w:t xml:space="preserve">more information on property tax bills; killed on the Senate floor 13–10.</w:t>
       </w:r>
     </w:p>
     <w:p>
@@ -3873,6 +4190,123 @@
           <w:szCs w:val="20"/>
           <w:rtl w:val="0"/>
         </w:rPr>
+        <w:t xml:space="preserve">HB99 (2023): </w:t>
+      </w:r>
+      <w:r>
+        <w:rPr>
+          <w:rFonts w:ascii="Arial" w:cs="Arial" w:eastAsia="Arial" w:hAnsi="Arial"/>
+          <w:color w:val="444444"/>
+          <w:sz w:val="20"/>
+          <w:szCs w:val="20"/>
+          <w:rtl w:val="0"/>
+        </w:rPr>
+        <w:t xml:space="preserve">rebate-program information printed on tax bills; killed in the House.</w:t>
+      </w:r>
+    </w:p>
+    <w:p>
+      <w:pPr>
+        <w:spacing w:after="80"/>
+        <w:ind w:left="200" w:firstLine="0"/>
+        <w:rPr/>
+      </w:pPr>
+      <w:r>
+        <w:rPr>
+          <w:rFonts w:ascii="Arial" w:cs="Arial" w:eastAsia="Arial" w:hAnsi="Arial"/>
+          <w:color w:val="c0392b"/>
+          <w:sz w:val="20"/>
+          <w:szCs w:val="20"/>
+          <w:rtl w:val="0"/>
+        </w:rPr>
+        <w:t xml:space="preserve">▪  </w:t>
+      </w:r>
+      <w:r>
+        <w:rPr>
+          <w:rFonts w:ascii="Arial" w:cs="Arial" w:eastAsia="Arial" w:hAnsi="Arial"/>
+          <w:b w:val="1"/>
+          <w:bCs w:val="1"/>
+          <w:color w:val="1a2d4f"/>
+          <w:sz w:val="20"/>
+          <w:szCs w:val="20"/>
+          <w:rtl w:val="0"/>
+        </w:rPr>
+        <w:t xml:space="preserve">SB217 (2025): </w:t>
+      </w:r>
+      <w:r>
+        <w:rPr>
+          <w:rFonts w:ascii="Arial" w:cs="Arial" w:eastAsia="Arial" w:hAnsi="Arial"/>
+          <w:color w:val="444444"/>
+          <w:sz w:val="20"/>
+          <w:szCs w:val="20"/>
+          <w:rtl w:val="0"/>
+        </w:rPr>
+        <w:t xml:space="preserve">public notice of historic tax rates and project tax impacts; killed in the House.</w:t>
+      </w:r>
+    </w:p>
+    <w:p>
+      <w:pPr>
+        <w:spacing w:after="80"/>
+        <w:ind w:left="200" w:firstLine="0"/>
+        <w:rPr/>
+      </w:pPr>
+      <w:r>
+        <w:rPr>
+          <w:rFonts w:ascii="Arial" w:cs="Arial" w:eastAsia="Arial" w:hAnsi="Arial"/>
+          <w:color w:val="c0392b"/>
+          <w:sz w:val="20"/>
+          <w:szCs w:val="20"/>
+          <w:rtl w:val="0"/>
+        </w:rPr>
+        <w:t xml:space="preserve">▪  </w:t>
+      </w:r>
+      <w:r>
+        <w:rPr>
+          <w:rFonts w:ascii="Arial" w:cs="Arial" w:eastAsia="Arial" w:hAnsi="Arial"/>
+          <w:b w:val="1"/>
+          <w:bCs w:val="1"/>
+          <w:color w:val="1a2d4f"/>
+          <w:sz w:val="20"/>
+          <w:szCs w:val="20"/>
+          <w:rtl w:val="0"/>
+        </w:rPr>
+        <w:t xml:space="preserve">HB782 (2025): </w:t>
+      </w:r>
+      <w:r>
+        <w:rPr>
+          <w:rFonts w:ascii="Arial" w:cs="Arial" w:eastAsia="Arial" w:hAnsi="Arial"/>
+          <w:color w:val="444444"/>
+          <w:sz w:val="20"/>
+          <w:szCs w:val="20"/>
+          <w:rtl w:val="0"/>
+        </w:rPr>
+        <w:t xml:space="preserve">relief-program public awareness (with exemption expansions); killed.</w:t>
+      </w:r>
+    </w:p>
+    <w:p>
+      <w:pPr>
+        <w:spacing w:after="80"/>
+        <w:ind w:left="200" w:firstLine="0"/>
+        <w:rPr/>
+      </w:pPr>
+      <w:r>
+        <w:rPr>
+          <w:rFonts w:ascii="Arial" w:cs="Arial" w:eastAsia="Arial" w:hAnsi="Arial"/>
+          <w:color w:val="c0392b"/>
+          <w:sz w:val="20"/>
+          <w:szCs w:val="20"/>
+          <w:rtl w:val="0"/>
+        </w:rPr>
+        <w:t xml:space="preserve">▪  </w:t>
+      </w:r>
+      <w:r>
+        <w:rPr>
+          <w:rFonts w:ascii="Arial" w:cs="Arial" w:eastAsia="Arial" w:hAnsi="Arial"/>
+          <w:b w:val="1"/>
+          <w:bCs w:val="1"/>
+          <w:color w:val="1a2d4f"/>
+          <w:sz w:val="20"/>
+          <w:szCs w:val="20"/>
+          <w:rtl w:val="0"/>
+        </w:rPr>
         <w:t xml:space="preserve">HB1516 (2026): </w:t>
       </w:r>
       <w:r>
@@ -3884,6 +4318,45 @@
           <w:rtl w:val="0"/>
         </w:rPr>
         <w:t xml:space="preserve">charts and QR codes on tax bills showing where the money goes; interim study.</w:t>
+      </w:r>
+    </w:p>
+    <w:p>
+      <w:pPr>
+        <w:spacing w:after="80"/>
+        <w:ind w:left="200" w:firstLine="0"/>
+        <w:rPr/>
+      </w:pPr>
+      <w:r>
+        <w:rPr>
+          <w:rFonts w:ascii="Arial" w:cs="Arial" w:eastAsia="Arial" w:hAnsi="Arial"/>
+          <w:color w:val="c0392b"/>
+          <w:sz w:val="20"/>
+          <w:szCs w:val="20"/>
+          <w:rtl w:val="0"/>
+        </w:rPr>
+        <w:t xml:space="preserve">▪  </w:t>
+      </w:r>
+      <w:r>
+        <w:rPr>
+          <w:rFonts w:ascii="Arial" w:cs="Arial" w:eastAsia="Arial" w:hAnsi="Arial"/>
+          <w:b w:val="1"/>
+          <w:bCs w:val="1"/>
+          <w:color w:val="1a2d4f"/>
+          <w:sz w:val="20"/>
+          <w:szCs w:val="20"/>
+          <w:rtl w:val="0"/>
+        </w:rPr>
+        <w:t xml:space="preserve">HB1581 (2026): </w:t>
+      </w:r>
+      <w:r>
+        <w:rPr>
+          <w:rFonts w:ascii="Arial" w:cs="Arial" w:eastAsia="Arial" w:hAnsi="Arial"/>
+          <w:color w:val="444444"/>
+          <w:sz w:val="20"/>
+          <w:szCs w:val="20"/>
+          <w:rtl w:val="0"/>
+        </w:rPr>
+        <w:t xml:space="preserve">notice to owners when assessed values change by set amounts; interim study.</w:t>
       </w:r>
     </w:p>
     <w:p>
@@ -4914,7 +5387,7 @@
           <w:szCs w:val="20"/>
           <w:rtl w:val="0"/>
         </w:rPr>
-        <w:t xml:space="preserve"> A charter or ballot limit on how fast a town, city, or school district budget may grow; cap laws passed in 2021, 2024, 2025, and 2026.</w:t>
+        <w:t xml:space="preserve"> A charter or ballot limit on how fast a town, city, or school district budget may grow; cap and budget-cap laws passed in 2021, 2024, 2025 (three, including SB105's town budget caps), and 2026.</w:t>
       </w:r>
     </w:p>
     <w:p>

</xml_diff>

<commit_message>
Clean pagination for the lege brief (--polish-breaks exporter knob, default off): navy double rule restored above Policy Spotlights + template gray rules; template-faithful glossary section structure; Glossary and Legislative Process Glossary each on their own single page; keep-with-next headings + widow control (no orphan headings/lines); spotlights tightened so pages end cleanly; glossary trimmed to body-referenced terms; 8pp verified, scans re-pass
Co-authored-by: CaptainWrechols <CaptainWrechols@users.noreply.github.com>
</commit_message>
<xml_diff>
--- a/briefs/new-hampshire/property-taxes/citizen-v2/NH1-Property-Taxes-Lege-Brief.docx
+++ b/briefs/new-hampshire/property-taxes/citizen-v2/NH1-Property-Taxes-Lege-Brief.docx
@@ -4,6 +4,7 @@
   <w:body>
     <w:p>
       <w:pPr>
+        <w:keepNext/>
         <w:spacing w:after="40" w:line="276" w:lineRule="auto"/>
         <w:rPr/>
       </w:pPr>
@@ -22,6 +23,7 @@
     </w:p>
     <w:p>
       <w:pPr>
+        <w:keepNext/>
         <w:spacing w:after="120" w:line="276" w:lineRule="auto"/>
         <w:rPr/>
       </w:pPr>
@@ -38,6 +40,7 @@
     </w:p>
     <w:p>
       <w:pPr>
+        <w:keepNext/>
         <w:spacing w:before="84" w:after="36" w:line="276" w:lineRule="auto"/>
         <w:rPr/>
       </w:pPr>
@@ -56,6 +59,7 @@
     </w:p>
     <w:p>
       <w:pPr>
+        <w:widowControl/>
         <w:spacing w:after="49" w:line="276" w:lineRule="auto"/>
         <w:rPr/>
       </w:pPr>
@@ -347,6 +351,7 @@
     </w:p>
     <w:p>
       <w:pPr>
+        <w:keepNext/>
         <w:spacing w:before="84" w:after="36" w:line="276" w:lineRule="auto"/>
         <w:rPr/>
       </w:pPr>
@@ -365,6 +370,7 @@
     </w:p>
     <w:p>
       <w:pPr>
+        <w:widowControl/>
         <w:spacing w:after="49" w:line="276" w:lineRule="auto"/>
         <w:rPr/>
       </w:pPr>
@@ -381,6 +387,7 @@
     </w:p>
     <w:p>
       <w:pPr>
+        <w:keepNext/>
         <w:spacing w:before="84" w:after="36" w:line="276" w:lineRule="auto"/>
         <w:rPr/>
       </w:pPr>
@@ -399,6 +406,7 @@
     </w:p>
     <w:p>
       <w:pPr>
+        <w:keepNext/>
         <w:spacing w:after="36" w:line="276" w:lineRule="auto"/>
         <w:rPr/>
       </w:pPr>
@@ -417,6 +425,7 @@
     </w:p>
     <w:p>
       <w:pPr>
+        <w:keepNext/>
         <w:spacing w:before="70" w:after="30" w:line="276" w:lineRule="auto"/>
         <w:rPr/>
       </w:pPr>
@@ -435,6 +444,7 @@
     </w:p>
     <w:p>
       <w:pPr>
+        <w:widowControl/>
         <w:spacing w:after="49" w:line="276" w:lineRule="auto"/>
         <w:rPr/>
       </w:pPr>
@@ -529,6 +539,7 @@
     </w:p>
     <w:p>
       <w:pPr>
+        <w:keepNext/>
         <w:spacing w:before="70" w:after="30" w:line="276" w:lineRule="auto"/>
         <w:rPr/>
       </w:pPr>
@@ -547,6 +558,7 @@
     </w:p>
     <w:p>
       <w:pPr>
+        <w:widowControl/>
         <w:spacing w:after="49" w:line="276" w:lineRule="auto"/>
         <w:rPr/>
       </w:pPr>
@@ -707,6 +719,7 @@
     </w:p>
     <w:p>
       <w:pPr>
+        <w:keepNext/>
         <w:spacing w:before="84" w:after="36" w:line="276" w:lineRule="auto"/>
         <w:rPr/>
       </w:pPr>
@@ -725,6 +738,7 @@
     </w:p>
     <w:p>
       <w:pPr>
+        <w:keepNext/>
         <w:spacing w:after="36" w:line="276" w:lineRule="auto"/>
         <w:rPr/>
       </w:pPr>
@@ -743,6 +757,7 @@
     </w:p>
     <w:p>
       <w:pPr>
+        <w:widowControl/>
         <w:spacing w:after="49" w:line="276" w:lineRule="auto"/>
         <w:rPr/>
       </w:pPr>
@@ -771,6 +786,7 @@
     </w:p>
     <w:p>
       <w:pPr>
+        <w:widowControl/>
         <w:spacing w:after="49" w:line="276" w:lineRule="auto"/>
         <w:rPr/>
       </w:pPr>
@@ -799,6 +815,7 @@
     </w:p>
     <w:p>
       <w:pPr>
+        <w:widowControl/>
         <w:spacing w:after="49" w:line="276" w:lineRule="auto"/>
         <w:rPr/>
       </w:pPr>
@@ -827,6 +844,7 @@
     </w:p>
     <w:p>
       <w:pPr>
+        <w:widowControl/>
         <w:spacing w:after="49" w:line="276" w:lineRule="auto"/>
         <w:rPr/>
       </w:pPr>
@@ -855,6 +873,7 @@
     </w:p>
     <w:p>
       <w:pPr>
+        <w:widowControl/>
         <w:spacing w:after="49" w:line="276" w:lineRule="auto"/>
         <w:rPr/>
       </w:pPr>
@@ -949,6 +968,7 @@
     </w:p>
     <w:p>
       <w:pPr>
+        <w:keepNext/>
         <w:spacing w:before="84" w:after="36" w:line="276" w:lineRule="auto"/>
         <w:rPr/>
       </w:pPr>
@@ -967,6 +987,7 @@
     </w:p>
     <w:p>
       <w:pPr>
+        <w:keepNext/>
         <w:spacing w:after="36" w:line="276" w:lineRule="auto"/>
         <w:rPr/>
       </w:pPr>
@@ -985,6 +1006,7 @@
     </w:p>
     <w:p>
       <w:pPr>
+        <w:keepNext/>
         <w:spacing w:before="70" w:after="30" w:line="276" w:lineRule="auto"/>
         <w:rPr/>
       </w:pPr>
@@ -1003,6 +1025,7 @@
     </w:p>
     <w:p>
       <w:pPr>
+        <w:widowControl/>
         <w:spacing w:after="49" w:line="276" w:lineRule="auto"/>
         <w:rPr/>
       </w:pPr>
@@ -1019,6 +1042,7 @@
     </w:p>
     <w:p>
       <w:pPr>
+        <w:keepNext/>
         <w:spacing w:before="70" w:after="30" w:line="276" w:lineRule="auto"/>
         <w:rPr/>
       </w:pPr>
@@ -1037,6 +1061,7 @@
     </w:p>
     <w:p>
       <w:pPr>
+        <w:widowControl/>
         <w:spacing w:after="49" w:line="276" w:lineRule="auto"/>
         <w:rPr/>
       </w:pPr>
@@ -1053,6 +1078,7 @@
     </w:p>
     <w:p>
       <w:pPr>
+        <w:keepNext/>
         <w:spacing w:before="84" w:after="36" w:line="276" w:lineRule="auto"/>
         <w:rPr/>
       </w:pPr>
@@ -1071,6 +1097,7 @@
     </w:p>
     <w:p>
       <w:pPr>
+        <w:keepNext/>
         <w:spacing w:after="36" w:line="276" w:lineRule="auto"/>
         <w:rPr/>
       </w:pPr>
@@ -1089,6 +1116,7 @@
     </w:p>
     <w:p>
       <w:pPr>
+        <w:widowControl/>
         <w:spacing w:after="49" w:line="276" w:lineRule="auto"/>
         <w:rPr/>
       </w:pPr>
@@ -1117,6 +1145,7 @@
     </w:p>
     <w:p>
       <w:pPr>
+        <w:widowControl/>
         <w:spacing w:after="49" w:line="276" w:lineRule="auto"/>
         <w:rPr/>
       </w:pPr>
@@ -1145,6 +1174,7 @@
     </w:p>
     <w:p>
       <w:pPr>
+        <w:widowControl/>
         <w:spacing w:after="49" w:line="276" w:lineRule="auto"/>
         <w:rPr/>
       </w:pPr>
@@ -1173,6 +1203,7 @@
     </w:p>
     <w:p>
       <w:pPr>
+        <w:widowControl/>
         <w:spacing w:after="49" w:line="276" w:lineRule="auto"/>
         <w:rPr/>
       </w:pPr>
@@ -1201,6 +1232,7 @@
     </w:p>
     <w:p>
       <w:pPr>
+        <w:widowControl/>
         <w:spacing w:after="49" w:line="276" w:lineRule="auto"/>
         <w:rPr/>
       </w:pPr>
@@ -1229,6 +1261,7 @@
     </w:p>
     <w:p>
       <w:pPr>
+        <w:keepNext/>
         <w:spacing w:before="84" w:after="36" w:line="276" w:lineRule="auto"/>
         <w:rPr/>
       </w:pPr>
@@ -1247,6 +1280,7 @@
     </w:p>
     <w:p>
       <w:pPr>
+        <w:widowControl/>
         <w:spacing w:after="49" w:line="276" w:lineRule="auto"/>
         <w:rPr/>
       </w:pPr>
@@ -1297,6 +1331,7 @@
     </w:p>
     <w:p>
       <w:pPr>
+        <w:widowControl/>
         <w:spacing w:after="49" w:line="276" w:lineRule="auto"/>
         <w:rPr/>
       </w:pPr>
@@ -1325,6 +1360,7 @@
     </w:p>
     <w:p>
       <w:pPr>
+        <w:keepNext/>
         <w:spacing w:before="84" w:after="36" w:line="276" w:lineRule="auto"/>
         <w:rPr/>
       </w:pPr>
@@ -1343,6 +1379,7 @@
     </w:p>
     <w:p>
       <w:pPr>
+        <w:keepNext/>
         <w:spacing w:after="36" w:line="276" w:lineRule="auto"/>
         <w:rPr/>
       </w:pPr>
@@ -1361,6 +1398,7 @@
     </w:p>
     <w:p>
       <w:pPr>
+        <w:widowControl/>
         <w:spacing w:after="49" w:line="276" w:lineRule="auto"/>
         <w:rPr/>
       </w:pPr>
@@ -1377,6 +1415,9 @@
     </w:p>
     <w:p>
       <w:pPr>
+        <w:pBdr>
+          <w:top w:color="c8cdd6" w:space="4" w:sz="6" w:val="single"/>
+        </w:pBdr>
         <w:spacing w:before="40" w:after="0" w:line="276" w:lineRule="auto"/>
         <w:rPr/>
       </w:pPr>
@@ -1393,18 +1434,25 @@
     </w:p>
     <w:p>
       <w:pPr>
+        <w:pBdr>
+          <w:bottom w:color="1a2d4f" w:space="2" w:sz="20" w:val="single"/>
+        </w:pBdr>
         <w:spacing w:after="120" w:line="276" w:lineRule="auto"/>
         <w:rPr/>
       </w:pPr>
     </w:p>
     <w:p>
       <w:pPr>
+        <w:pBdr>
+          <w:bottom w:color="1a2d4f" w:space="2" w:sz="20" w:val="single"/>
+        </w:pBdr>
         <w:spacing w:after="120" w:line="276" w:lineRule="auto"/>
         <w:rPr/>
       </w:pPr>
     </w:p>
     <w:p>
       <w:pPr>
+        <w:keepNext/>
         <w:spacing w:after="40" w:line="252" w:lineRule="auto"/>
         <w:rPr/>
       </w:pPr>
@@ -1423,6 +1471,7 @@
     </w:p>
     <w:p>
       <w:pPr>
+        <w:keepNext/>
         <w:spacing w:after="120" w:line="254" w:lineRule="auto"/>
         <w:rPr/>
       </w:pPr>
@@ -1439,6 +1488,7 @@
     </w:p>
     <w:p>
       <w:pPr>
+        <w:keepNext/>
         <w:spacing w:before="84" w:after="36" w:line="254" w:lineRule="auto"/>
         <w:rPr/>
       </w:pPr>
@@ -1457,6 +1507,7 @@
     </w:p>
     <w:p>
       <w:pPr>
+        <w:keepNext/>
         <w:spacing w:after="60"/>
         <w:rPr/>
       </w:pPr>
@@ -1475,6 +1526,7 @@
     </w:p>
     <w:p>
       <w:pPr>
+        <w:keepNext/>
         <w:spacing w:before="70" w:after="30" w:line="250" w:lineRule="auto"/>
         <w:rPr/>
       </w:pPr>
@@ -1493,6 +1545,7 @@
     </w:p>
     <w:p>
       <w:pPr>
+        <w:widowControl/>
         <w:spacing w:after="80"/>
         <w:ind w:left="200" w:firstLine="0"/>
         <w:rPr/>
@@ -1517,60 +1570,22 @@
           <w:szCs w:val="20"/>
           <w:rtl w:val="0"/>
         </w:rPr>
-        <w:t xml:space="preserve">HB2 2021 (91:89, 91:99): </w:t>
-      </w:r>
-      <w:r>
-        <w:rPr>
-          <w:rFonts w:ascii="Arial" w:cs="Arial" w:eastAsia="Arial" w:hAnsi="Arial"/>
-          <w:color w:val="444444"/>
-          <w:sz w:val="20"/>
-          <w:szCs w:val="20"/>
-          <w:rtl w:val="0"/>
-        </w:rPr>
-        <w:t xml:space="preserve">the phase-out schedule — 4 percent in 2023, 3 percent in 2024 — and repeal set for 2027.</w:t>
-      </w:r>
-    </w:p>
-    <w:p>
-      <w:pPr>
-        <w:spacing w:after="80"/>
-        <w:ind w:left="200" w:firstLine="0"/>
-        <w:rPr/>
-      </w:pPr>
-      <w:r>
-        <w:rPr>
-          <w:rFonts w:ascii="Arial" w:cs="Arial" w:eastAsia="Arial" w:hAnsi="Arial"/>
-          <w:color w:val="c0392b"/>
-          <w:sz w:val="20"/>
-          <w:szCs w:val="20"/>
-          <w:rtl w:val="0"/>
-        </w:rPr>
-        <w:t xml:space="preserve">▪  </w:t>
-      </w:r>
-      <w:r>
-        <w:rPr>
-          <w:rFonts w:ascii="Arial" w:cs="Arial" w:eastAsia="Arial" w:hAnsi="Arial"/>
-          <w:b w:val="1"/>
-          <w:bCs w:val="1"/>
-          <w:color w:val="1a2d4f"/>
-          <w:sz w:val="20"/>
-          <w:szCs w:val="20"/>
-          <w:rtl w:val="0"/>
-        </w:rPr>
-        <w:t xml:space="preserve">HB2 2023 (79:85–88): </w:t>
-      </w:r>
-      <w:r>
-        <w:rPr>
-          <w:rFonts w:ascii="Arial" w:cs="Arial" w:eastAsia="Arial" w:hAnsi="Arial"/>
-          <w:color w:val="444444"/>
-          <w:sz w:val="20"/>
-          <w:szCs w:val="20"/>
-          <w:rtl w:val="0"/>
-        </w:rPr>
-        <w:t xml:space="preserve">repeal accelerated two years, to January 1, 2025. Votes were on each whole trailer; the 2021 trailer passed the House 198–181.</w:t>
-      </w:r>
-    </w:p>
-    <w:p>
-      <w:pPr>
+        <w:t xml:space="preserve">HB2 2021 (91:89, 91:99) and HB2 2023 (79:85–88): </w:t>
+      </w:r>
+      <w:r>
+        <w:rPr>
+          <w:rFonts w:ascii="Arial" w:cs="Arial" w:eastAsia="Arial" w:hAnsi="Arial"/>
+          <w:color w:val="444444"/>
+          <w:sz w:val="20"/>
+          <w:szCs w:val="20"/>
+          <w:rtl w:val="0"/>
+        </w:rPr>
+        <w:t xml:space="preserve">the phase-out schedule — 4 percent in 2023, 3 percent in 2024, repeal in 2027 — then the repeal pulled up to January 1, 2025. Votes were on each whole trailer; the 2021 trailer passed the House 198–181.</w:t>
+      </w:r>
+    </w:p>
+    <w:p>
+      <w:pPr>
+        <w:keepNext/>
         <w:spacing w:before="70" w:after="30" w:line="250" w:lineRule="auto"/>
         <w:rPr/>
       </w:pPr>
@@ -1589,6 +1604,7 @@
     </w:p>
     <w:p>
       <w:pPr>
+        <w:widowControl/>
         <w:spacing w:after="80"/>
         <w:ind w:left="200" w:firstLine="0"/>
         <w:rPr/>
@@ -1628,6 +1644,7 @@
     </w:p>
     <w:p>
       <w:pPr>
+        <w:widowControl/>
         <w:spacing w:after="80"/>
         <w:ind w:left="200" w:firstLine="0"/>
         <w:rPr/>
@@ -1667,6 +1684,7 @@
     </w:p>
     <w:p>
       <w:pPr>
+        <w:widowControl/>
         <w:spacing w:after="80"/>
         <w:ind w:left="200" w:firstLine="0"/>
         <w:rPr/>
@@ -1706,6 +1724,7 @@
     </w:p>
     <w:p>
       <w:pPr>
+        <w:widowControl/>
         <w:spacing w:after="80"/>
         <w:ind w:left="200" w:firstLine="0"/>
         <w:rPr/>
@@ -1745,6 +1764,7 @@
     </w:p>
     <w:p>
       <w:pPr>
+        <w:keepNext/>
         <w:spacing w:before="70" w:after="30" w:line="250" w:lineRule="auto"/>
         <w:rPr/>
       </w:pPr>
@@ -1763,6 +1783,7 @@
     </w:p>
     <w:p>
       <w:pPr>
+        <w:widowControl/>
         <w:spacing w:after="80"/>
         <w:ind w:left="200" w:firstLine="0"/>
         <w:rPr/>
@@ -1802,6 +1823,7 @@
     </w:p>
     <w:p>
       <w:pPr>
+        <w:keepNext/>
         <w:spacing w:before="84" w:after="36" w:line="254" w:lineRule="auto"/>
         <w:rPr/>
       </w:pPr>
@@ -1820,6 +1842,7 @@
     </w:p>
     <w:p>
       <w:pPr>
+        <w:keepNext/>
         <w:spacing w:after="60"/>
         <w:rPr/>
       </w:pPr>
@@ -1838,6 +1861,7 @@
     </w:p>
     <w:p>
       <w:pPr>
+        <w:keepNext/>
         <w:spacing w:before="70" w:after="30" w:line="250" w:lineRule="auto"/>
         <w:rPr/>
       </w:pPr>
@@ -1856,6 +1880,7 @@
     </w:p>
     <w:p>
       <w:pPr>
+        <w:widowControl/>
         <w:spacing w:after="80"/>
         <w:ind w:left="200" w:firstLine="0"/>
         <w:rPr/>
@@ -1890,11 +1915,12 @@
           <w:szCs w:val="20"/>
           <w:rtl w:val="0"/>
         </w:rPr>
-        <w:t xml:space="preserve">slot-style machines at charitable gaming facilities, with a 31 percent state take — the biggest new revenue source of the period.</w:t>
-      </w:r>
-    </w:p>
-    <w:p>
-      <w:pPr>
+        <w:t xml:space="preserve">slot-style machines at charitable gaming facilities — a 31 percent state take, the period's biggest new revenue source.</w:t>
+      </w:r>
+    </w:p>
+    <w:p>
+      <w:pPr>
+        <w:widowControl/>
         <w:spacing w:after="80"/>
         <w:ind w:left="200" w:firstLine="0"/>
         <w:rPr/>
@@ -1934,6 +1960,7 @@
     </w:p>
     <w:p>
       <w:pPr>
+        <w:widowControl/>
         <w:spacing w:after="80"/>
         <w:ind w:left="200" w:firstLine="0"/>
         <w:rPr/>
@@ -1973,6 +2000,7 @@
     </w:p>
     <w:p>
       <w:pPr>
+        <w:widowControl/>
         <w:spacing w:after="80"/>
         <w:ind w:left="200" w:firstLine="0"/>
         <w:rPr/>
@@ -2012,6 +2040,7 @@
     </w:p>
     <w:p>
       <w:pPr>
+        <w:keepNext/>
         <w:spacing w:before="70" w:after="30" w:line="250" w:lineRule="auto"/>
         <w:rPr/>
       </w:pPr>
@@ -2030,6 +2059,7 @@
     </w:p>
     <w:p>
       <w:pPr>
+        <w:widowControl/>
         <w:spacing w:after="80"/>
         <w:ind w:left="200" w:firstLine="0"/>
         <w:rPr/>
@@ -2064,11 +2094,12 @@
           <w:szCs w:val="20"/>
           <w:rtl w:val="0"/>
         </w:rPr>
-        <w:t xml:space="preserve">online gambling for community-college scholarships; passed the Senate 13–11, indefinitely postponed by the House.</w:t>
-      </w:r>
-    </w:p>
-    <w:p>
-      <w:pPr>
+        <w:t xml:space="preserve">online gambling for community-college scholarships; Senate 13–11, postponed by the House.</w:t>
+      </w:r>
+    </w:p>
+    <w:p>
+      <w:pPr>
+        <w:widowControl/>
         <w:spacing w:after="80"/>
         <w:ind w:left="200" w:firstLine="0"/>
         <w:rPr/>
@@ -2108,6 +2139,7 @@
     </w:p>
     <w:p>
       <w:pPr>
+        <w:widowControl/>
         <w:spacing w:after="80"/>
         <w:ind w:left="200" w:firstLine="0"/>
         <w:rPr/>
@@ -2132,60 +2164,22 @@
           <w:szCs w:val="20"/>
           <w:rtl w:val="0"/>
         </w:rPr>
-        <w:t xml:space="preserve">CACR1 and CACR2 (2021): </w:t>
-      </w:r>
-      <w:r>
-        <w:rPr>
-          <w:rFonts w:ascii="Arial" w:cs="Arial" w:eastAsia="Arial" w:hAnsi="Arial"/>
-          <w:color w:val="444444"/>
-          <w:sz w:val="20"/>
-          <w:szCs w:val="20"/>
-          <w:rtl w:val="0"/>
-        </w:rPr>
-        <w:t xml:space="preserve">the income-tax and sales-tax bans; majorities of 202–171 and 201–170, short of three-fifths.</w:t>
-      </w:r>
-    </w:p>
-    <w:p>
-      <w:pPr>
-        <w:spacing w:after="80"/>
-        <w:ind w:left="200" w:firstLine="0"/>
-        <w:rPr/>
-      </w:pPr>
-      <w:r>
-        <w:rPr>
-          <w:rFonts w:ascii="Arial" w:cs="Arial" w:eastAsia="Arial" w:hAnsi="Arial"/>
-          <w:color w:val="c0392b"/>
-          <w:sz w:val="20"/>
-          <w:szCs w:val="20"/>
-          <w:rtl w:val="0"/>
-        </w:rPr>
-        <w:t xml:space="preserve">▪  </w:t>
-      </w:r>
-      <w:r>
-        <w:rPr>
-          <w:rFonts w:ascii="Arial" w:cs="Arial" w:eastAsia="Arial" w:hAnsi="Arial"/>
-          <w:b w:val="1"/>
-          <w:bCs w:val="1"/>
-          <w:color w:val="1a2d4f"/>
-          <w:sz w:val="20"/>
-          <w:szCs w:val="20"/>
-          <w:rtl w:val="0"/>
-        </w:rPr>
-        <w:t xml:space="preserve">CACR10 and CACR12 (2026): </w:t>
-      </w:r>
-      <w:r>
-        <w:rPr>
-          <w:rFonts w:ascii="Arial" w:cs="Arial" w:eastAsia="Arial" w:hAnsi="Arial"/>
-          <w:color w:val="444444"/>
-          <w:sz w:val="20"/>
-          <w:szCs w:val="20"/>
-          <w:rtl w:val="0"/>
-        </w:rPr>
-        <w:t xml:space="preserve">the tax-law-adoption amendments; 194–158 and 193–148 in the House (CACR12 had passed the Senate 16–8), also short of three-fifths.</w:t>
-      </w:r>
-    </w:p>
-    <w:p>
-      <w:pPr>
+        <w:t xml:space="preserve">CACR1 and CACR2 (2021); CACR10 and CACR12 (2026): </w:t>
+      </w:r>
+      <w:r>
+        <w:rPr>
+          <w:rFonts w:ascii="Arial" w:cs="Arial" w:eastAsia="Arial" w:hAnsi="Arial"/>
+          <w:color w:val="444444"/>
+          <w:sz w:val="20"/>
+          <w:szCs w:val="20"/>
+          <w:rtl w:val="0"/>
+        </w:rPr>
+        <w:t xml:space="preserve">the income/sales-tax bans and the tax-law-adoption amendments — House majorities of 202–171, 201–170, 194–158, and 193–148, every one short of three-fifths.</w:t>
+      </w:r>
+    </w:p>
+    <w:p>
+      <w:pPr>
+        <w:keepNext/>
         <w:spacing w:before="70" w:after="30" w:line="250" w:lineRule="auto"/>
         <w:rPr/>
       </w:pPr>
@@ -2204,6 +2198,7 @@
     </w:p>
     <w:p>
       <w:pPr>
+        <w:widowControl/>
         <w:spacing w:after="80"/>
         <w:ind w:left="200" w:firstLine="0"/>
         <w:rPr/>
@@ -2243,6 +2238,7 @@
     </w:p>
     <w:p>
       <w:pPr>
+        <w:widowControl/>
         <w:spacing w:after="80"/>
         <w:ind w:left="200" w:firstLine="0"/>
         <w:rPr/>
@@ -2282,6 +2278,7 @@
     </w:p>
     <w:p>
       <w:pPr>
+        <w:widowControl/>
         <w:spacing w:after="80"/>
         <w:ind w:left="200" w:firstLine="0"/>
         <w:rPr/>
@@ -2321,6 +2318,7 @@
     </w:p>
     <w:p>
       <w:pPr>
+        <w:widowControl/>
         <w:spacing w:after="80"/>
         <w:ind w:left="200" w:firstLine="0"/>
         <w:rPr/>
@@ -2360,6 +2358,7 @@
     </w:p>
     <w:p>
       <w:pPr>
+        <w:widowControl/>
         <w:spacing w:after="80"/>
         <w:ind w:left="200" w:firstLine="0"/>
         <w:rPr/>
@@ -2399,6 +2398,7 @@
     </w:p>
     <w:p>
       <w:pPr>
+        <w:widowControl/>
         <w:spacing w:after="80"/>
         <w:ind w:left="200" w:firstLine="0"/>
         <w:rPr/>
@@ -2438,6 +2438,7 @@
     </w:p>
     <w:p>
       <w:pPr>
+        <w:widowControl/>
         <w:spacing w:after="80"/>
         <w:ind w:left="200" w:firstLine="0"/>
         <w:rPr/>
@@ -2477,6 +2478,7 @@
     </w:p>
     <w:p>
       <w:pPr>
+        <w:keepNext/>
         <w:spacing w:before="84" w:after="36" w:line="254" w:lineRule="auto"/>
         <w:rPr/>
       </w:pPr>
@@ -2495,6 +2497,7 @@
     </w:p>
     <w:p>
       <w:pPr>
+        <w:keepNext/>
         <w:spacing w:after="60"/>
         <w:rPr/>
       </w:pPr>
@@ -2513,6 +2516,7 @@
     </w:p>
     <w:p>
       <w:pPr>
+        <w:keepNext/>
         <w:spacing w:before="70" w:after="30" w:line="250" w:lineRule="auto"/>
         <w:rPr/>
       </w:pPr>
@@ -2531,6 +2535,7 @@
     </w:p>
     <w:p>
       <w:pPr>
+        <w:widowControl/>
         <w:spacing w:after="80"/>
         <w:ind w:left="200" w:firstLine="0"/>
         <w:rPr/>
@@ -2565,11 +2570,12 @@
           <w:szCs w:val="20"/>
           <w:rtl w:val="0"/>
         </w:rPr>
-        <w:t xml:space="preserve">BPT 7.7 to 7.6 percent, BET 0.675 to 0.55 percent, meals and rooms 9 to 8.5 percent.</w:t>
-      </w:r>
-    </w:p>
-    <w:p>
-      <w:pPr>
+        <w:t xml:space="preserve">BPT 7.7 to 7.6, BET 0.675 to 0.55, meals and rooms 9 to 8.5 percent.</w:t>
+      </w:r>
+    </w:p>
+    <w:p>
+      <w:pPr>
+        <w:widowControl/>
         <w:spacing w:after="80"/>
         <w:ind w:left="200" w:firstLine="0"/>
         <w:rPr/>
@@ -2604,11 +2610,12 @@
           <w:szCs w:val="20"/>
           <w:rtl w:val="0"/>
         </w:rPr>
-        <w:t xml:space="preserve">BPT to 7.5 percent, passed the House 177–141 — paired with a one-time payment to towns worth 7.5 percent of their retirement contributions.</w:t>
-      </w:r>
-    </w:p>
-    <w:p>
-      <w:pPr>
+        <w:t xml:space="preserve">BPT to 7.5 percent, passed the House 177–141 — paired with the one-time 7.5 percent municipal retirement payment.</w:t>
+      </w:r>
+    </w:p>
+    <w:p>
+      <w:pPr>
+        <w:widowControl/>
         <w:spacing w:after="80"/>
         <w:ind w:left="200" w:firstLine="0"/>
         <w:rPr/>
@@ -2648,6 +2655,7 @@
     </w:p>
     <w:p>
       <w:pPr>
+        <w:keepNext/>
         <w:spacing w:before="70" w:after="30" w:line="250" w:lineRule="auto"/>
         <w:rPr/>
       </w:pPr>
@@ -2666,6 +2674,7 @@
     </w:p>
     <w:p>
       <w:pPr>
+        <w:widowControl/>
         <w:spacing w:after="80"/>
         <w:ind w:left="200" w:firstLine="0"/>
         <w:rPr/>
@@ -2705,6 +2714,7 @@
     </w:p>
     <w:p>
       <w:pPr>
+        <w:widowControl/>
         <w:spacing w:after="80"/>
         <w:ind w:left="200" w:firstLine="0"/>
         <w:rPr/>
@@ -2744,6 +2754,7 @@
     </w:p>
     <w:p>
       <w:pPr>
+        <w:widowControl/>
         <w:spacing w:after="80"/>
         <w:ind w:left="200" w:firstLine="0"/>
         <w:rPr/>
@@ -2778,11 +2789,12 @@
           <w:szCs w:val="20"/>
           <w:rtl w:val="0"/>
         </w:rPr>
-        <w:t xml:space="preserve">raising the trust fund's business-tax shares; both killed — months before the trailer cut the shares instead.</w:t>
-      </w:r>
-    </w:p>
-    <w:p>
-      <w:pPr>
+        <w:t xml:space="preserve">raising the trust fund's business-tax shares; killed — months before the trailer cut them instead.</w:t>
+      </w:r>
+    </w:p>
+    <w:p>
+      <w:pPr>
+        <w:widowControl/>
         <w:spacing w:after="80"/>
         <w:ind w:left="200" w:firstLine="0"/>
         <w:rPr/>
@@ -2822,6 +2834,7 @@
     </w:p>
     <w:p>
       <w:pPr>
+        <w:widowControl/>
         <w:spacing w:after="80"/>
         <w:ind w:left="200" w:firstLine="0"/>
         <w:rPr/>
@@ -2861,6 +2874,7 @@
     </w:p>
     <w:p>
       <w:pPr>
+        <w:keepNext/>
         <w:spacing w:before="70" w:after="30" w:line="250" w:lineRule="auto"/>
         <w:rPr/>
       </w:pPr>
@@ -2879,6 +2893,7 @@
     </w:p>
     <w:p>
       <w:pPr>
+        <w:widowControl/>
         <w:spacing w:after="80"/>
         <w:ind w:left="200" w:firstLine="0"/>
         <w:rPr/>
@@ -2918,6 +2933,7 @@
     </w:p>
     <w:p>
       <w:pPr>
+        <w:keepNext/>
         <w:spacing w:before="84" w:after="36" w:line="254" w:lineRule="auto"/>
         <w:rPr/>
       </w:pPr>
@@ -2936,6 +2952,7 @@
     </w:p>
     <w:p>
       <w:pPr>
+        <w:keepNext/>
         <w:spacing w:after="60"/>
         <w:rPr/>
       </w:pPr>
@@ -2954,6 +2971,7 @@
     </w:p>
     <w:p>
       <w:pPr>
+        <w:keepNext/>
         <w:spacing w:before="70" w:after="30" w:line="250" w:lineRule="auto"/>
         <w:rPr/>
       </w:pPr>
@@ -2972,6 +2990,7 @@
     </w:p>
     <w:p>
       <w:pPr>
+        <w:widowControl/>
         <w:spacing w:after="80"/>
         <w:ind w:left="200" w:firstLine="0"/>
         <w:rPr/>
@@ -3006,11 +3025,12 @@
           <w:szCs w:val="20"/>
           <w:rtl w:val="0"/>
         </w:rPr>
-        <w:t xml:space="preserve">a state fund reimbursing towns for the elderly, disabled, blind, and deaf exemptions, financed by video lottery terminal revenue — the state paying for property-tax relief instead of shifting it onto other local taxpayers.</w:t>
-      </w:r>
-    </w:p>
-    <w:p>
-      <w:pPr>
+        <w:t xml:space="preserve">a state fund reimbursing towns for the elderly, disabled, blind, and deaf exemptions, financed by video lottery terminal revenue.</w:t>
+      </w:r>
+    </w:p>
+    <w:p>
+      <w:pPr>
+        <w:widowControl/>
         <w:spacing w:after="80"/>
         <w:ind w:left="200" w:firstLine="0"/>
         <w:rPr/>
@@ -3050,6 +3070,7 @@
     </w:p>
     <w:p>
       <w:pPr>
+        <w:keepNext/>
         <w:spacing w:before="70" w:after="30" w:line="250" w:lineRule="auto"/>
         <w:rPr/>
       </w:pPr>
@@ -3068,6 +3089,7 @@
     </w:p>
     <w:p>
       <w:pPr>
+        <w:widowControl/>
         <w:spacing w:after="80"/>
         <w:ind w:left="200" w:firstLine="0"/>
         <w:rPr/>
@@ -3107,6 +3129,7 @@
     </w:p>
     <w:p>
       <w:pPr>
+        <w:widowControl/>
         <w:spacing w:after="80"/>
         <w:ind w:left="200" w:firstLine="0"/>
         <w:rPr/>
@@ -3146,6 +3169,7 @@
     </w:p>
     <w:p>
       <w:pPr>
+        <w:widowControl/>
         <w:spacing w:after="80"/>
         <w:ind w:left="200" w:firstLine="0"/>
         <w:rPr/>
@@ -3185,6 +3209,7 @@
     </w:p>
     <w:p>
       <w:pPr>
+        <w:widowControl/>
         <w:spacing w:after="80"/>
         <w:ind w:left="200" w:firstLine="0"/>
         <w:rPr/>
@@ -3219,11 +3244,12 @@
           <w:szCs w:val="20"/>
           <w:rtl w:val="0"/>
         </w:rPr>
-        <w:t xml:space="preserve">the luxury second-home assessment; tabled 189–158, and the motion to take it back up failed 100–235.</w:t>
-      </w:r>
-    </w:p>
-    <w:p>
-      <w:pPr>
+        <w:t xml:space="preserve">the luxury second-home assessment; tabled 189–158, the rescue motion failing 100–235.</w:t>
+      </w:r>
+    </w:p>
+    <w:p>
+      <w:pPr>
+        <w:widowControl/>
         <w:spacing w:after="80"/>
         <w:ind w:left="200" w:firstLine="0"/>
         <w:rPr/>
@@ -3263,6 +3289,7 @@
     </w:p>
     <w:p>
       <w:pPr>
+        <w:widowControl/>
         <w:spacing w:after="80"/>
         <w:ind w:left="200" w:firstLine="0"/>
         <w:rPr/>
@@ -3297,11 +3324,12 @@
           <w:szCs w:val="20"/>
           <w:rtl w:val="0"/>
         </w:rPr>
-        <w:t xml:space="preserve">the municipal land value tax and cost-based assessment — the structural alternatives; both killed.</w:t>
-      </w:r>
-    </w:p>
-    <w:p>
-      <w:pPr>
+        <w:t xml:space="preserve">the land value tax and cost-based assessment; both killed.</w:t>
+      </w:r>
+    </w:p>
+    <w:p>
+      <w:pPr>
+        <w:widowControl/>
         <w:spacing w:after="80"/>
         <w:ind w:left="200" w:firstLine="0"/>
         <w:rPr/>
@@ -3336,11 +3364,12 @@
           <w:szCs w:val="20"/>
           <w:rtl w:val="0"/>
         </w:rPr>
-        <w:t xml:space="preserve">elderly-homeowner exemptions — the broad-relief versions; all killed in the House.</w:t>
-      </w:r>
-    </w:p>
-    <w:p>
-      <w:pPr>
+        <w:t xml:space="preserve">the broad elderly-homeowner exemptions; all killed in the House.</w:t>
+      </w:r>
+    </w:p>
+    <w:p>
+      <w:pPr>
+        <w:keepNext/>
         <w:spacing w:before="84" w:after="36" w:line="254" w:lineRule="auto"/>
         <w:rPr/>
       </w:pPr>
@@ -3359,6 +3388,7 @@
     </w:p>
     <w:p>
       <w:pPr>
+        <w:keepNext/>
         <w:spacing w:after="60"/>
         <w:rPr/>
       </w:pPr>
@@ -3377,6 +3407,7 @@
     </w:p>
     <w:p>
       <w:pPr>
+        <w:keepNext/>
         <w:spacing w:before="70" w:after="30" w:line="250" w:lineRule="auto"/>
         <w:rPr/>
       </w:pPr>
@@ -3395,6 +3426,7 @@
     </w:p>
     <w:p>
       <w:pPr>
+        <w:widowControl/>
         <w:spacing w:after="80"/>
         <w:ind w:left="200" w:firstLine="0"/>
         <w:rPr/>
@@ -3429,11 +3461,12 @@
           <w:szCs w:val="20"/>
           <w:rtl w:val="0"/>
         </w:rPr>
-        <w:t xml:space="preserve">rewrote how cooperative school districts split costs among towns — the one clearly pro-cooperation law.</w:t>
-      </w:r>
-    </w:p>
-    <w:p>
-      <w:pPr>
+        <w:t xml:space="preserve">rewrote how cooperative districts split costs — the one clearly pro-cooperation law.</w:t>
+      </w:r>
+    </w:p>
+    <w:p>
+      <w:pPr>
+        <w:widowControl/>
         <w:spacing w:after="80"/>
         <w:ind w:left="200" w:firstLine="0"/>
         <w:rPr/>
@@ -3468,11 +3501,12 @@
           <w:szCs w:val="20"/>
           <w:rtl w:val="0"/>
         </w:rPr>
-        <w:t xml:space="preserve">withdrawal-from-cooperative procedures; HB1374 passed the House 179–161 on its conference report.</w:t>
-      </w:r>
-    </w:p>
-    <w:p>
-      <w:pPr>
+        <w:t xml:space="preserve">withdrawal-from-cooperative procedures; HB1374 passed the House 179–161.</w:t>
+      </w:r>
+    </w:p>
+    <w:p>
+      <w:pPr>
+        <w:widowControl/>
         <w:spacing w:after="80"/>
         <w:ind w:left="200" w:firstLine="0"/>
         <w:rPr/>
@@ -3512,6 +3546,7 @@
     </w:p>
     <w:p>
       <w:pPr>
+        <w:keepNext/>
         <w:spacing w:before="70" w:after="30" w:line="250" w:lineRule="auto"/>
         <w:rPr/>
       </w:pPr>
@@ -3530,6 +3565,7 @@
     </w:p>
     <w:p>
       <w:pPr>
+        <w:widowControl/>
         <w:spacing w:after="80"/>
         <w:ind w:left="200" w:firstLine="0"/>
         <w:rPr/>
@@ -3564,11 +3600,12 @@
           <w:szCs w:val="20"/>
           <w:rtl w:val="0"/>
         </w:rPr>
-        <w:t xml:space="preserve">consolidating school administrative units with elected superintendents; a unanimous 18–0 Inexpedient to Legislate committee report, killed by voice vote.</w:t>
-      </w:r>
-    </w:p>
-    <w:p>
-      <w:pPr>
+        <w:t xml:space="preserve">consolidating school administrative units; a unanimous 18–0 Inexpedient to Legislate committee report, killed by voice vote.</w:t>
+      </w:r>
+    </w:p>
+    <w:p>
+      <w:pPr>
+        <w:widowControl/>
         <w:spacing w:after="80"/>
         <w:ind w:left="200" w:firstLine="0"/>
         <w:rPr/>
@@ -3608,6 +3645,7 @@
     </w:p>
     <w:p>
       <w:pPr>
+        <w:widowControl/>
         <w:spacing w:after="80"/>
         <w:ind w:left="200" w:firstLine="0"/>
         <w:rPr/>
@@ -3642,11 +3680,12 @@
           <w:szCs w:val="20"/>
           <w:rtl w:val="0"/>
         </w:rPr>
-        <w:t xml:space="preserve">school-building consolidation planning through the education department's 10-year facilities plans; died on the Senate table.</w:t>
-      </w:r>
-    </w:p>
-    <w:p>
-      <w:pPr>
+        <w:t xml:space="preserve">school-building consolidation planning through the state's 10-year facilities plans; died on the Senate table.</w:t>
+      </w:r>
+    </w:p>
+    <w:p>
+      <w:pPr>
+        <w:widowControl/>
         <w:spacing w:after="80"/>
         <w:ind w:left="200" w:firstLine="0"/>
         <w:rPr/>
@@ -3686,6 +3725,7 @@
     </w:p>
     <w:p>
       <w:pPr>
+        <w:widowControl/>
         <w:spacing w:after="80"/>
         <w:ind w:left="200" w:firstLine="0"/>
         <w:rPr/>
@@ -3725,6 +3765,7 @@
     </w:p>
     <w:p>
       <w:pPr>
+        <w:keepNext/>
         <w:spacing w:before="70" w:after="30" w:line="250" w:lineRule="auto"/>
         <w:rPr/>
       </w:pPr>
@@ -3743,6 +3784,7 @@
     </w:p>
     <w:p>
       <w:pPr>
+        <w:widowControl/>
         <w:spacing w:after="80"/>
         <w:ind w:left="200" w:firstLine="0"/>
         <w:rPr/>
@@ -3777,11 +3819,12 @@
           <w:szCs w:val="20"/>
           <w:rtl w:val="0"/>
         </w:rPr>
-        <w:t xml:space="preserve">State incentives for consolidating municipal or school services, shared-service grants, or a regionalization study — the certified record contains none. (Consolidation mandates were filed — see above — but nothing pays or rewards towns for combining services.)</w:t>
-      </w:r>
-    </w:p>
-    <w:p>
-      <w:pPr>
+        <w:t xml:space="preserve">State incentives for consolidating services, shared-service grants, or a regionalization study — the certified record contains none; the mandates above reorganize, but nothing pays towns to combine services.</w:t>
+      </w:r>
+    </w:p>
+    <w:p>
+      <w:pPr>
+        <w:keepNext/>
         <w:spacing w:before="84" w:after="36" w:line="254" w:lineRule="auto"/>
         <w:rPr/>
       </w:pPr>
@@ -3800,6 +3843,7 @@
     </w:p>
     <w:p>
       <w:pPr>
+        <w:keepNext/>
         <w:spacing w:after="60"/>
         <w:rPr/>
       </w:pPr>
@@ -3818,6 +3862,7 @@
     </w:p>
     <w:p>
       <w:pPr>
+        <w:keepNext/>
         <w:spacing w:before="70" w:after="30" w:line="250" w:lineRule="auto"/>
         <w:rPr/>
       </w:pPr>
@@ -3836,6 +3881,7 @@
     </w:p>
     <w:p>
       <w:pPr>
+        <w:widowControl/>
         <w:spacing w:after="80"/>
         <w:ind w:left="200" w:firstLine="0"/>
         <w:rPr/>
@@ -3870,11 +3916,12 @@
           <w:szCs w:val="20"/>
           <w:rtl w:val="0"/>
         </w:rPr>
-        <w:t xml:space="preserve">multi-year tax-impact notation required on warrant articles (Chapter 144) — the thread's first win.</w:t>
-      </w:r>
-    </w:p>
-    <w:p>
-      <w:pPr>
+        <w:t xml:space="preserve">multi-year tax-impact notation on warrant articles (Chapter 144) — the thread's first win.</w:t>
+      </w:r>
+    </w:p>
+    <w:p>
+      <w:pPr>
+        <w:widowControl/>
         <w:spacing w:after="80"/>
         <w:ind w:left="200" w:firstLine="0"/>
         <w:rPr/>
@@ -3909,11 +3956,12 @@
           <w:szCs w:val="20"/>
           <w:rtl w:val="0"/>
         </w:rPr>
-        <w:t xml:space="preserve">tax rate and tax impact information required on warrant articles; passed the House 185–150 (Chapter 312).</w:t>
-      </w:r>
-    </w:p>
-    <w:p>
-      <w:pPr>
+        <w:t xml:space="preserve">tax rate and tax impact information on warrant articles; House 185–150 (Chapter 312).</w:t>
+      </w:r>
+    </w:p>
+    <w:p>
+      <w:pPr>
+        <w:widowControl/>
         <w:spacing w:after="80"/>
         <w:ind w:left="200" w:firstLine="0"/>
         <w:rPr/>
@@ -3948,11 +3996,12 @@
           <w:szCs w:val="20"/>
           <w:rtl w:val="0"/>
         </w:rPr>
-        <w:t xml:space="preserve">quarterly public reports to the fiscal committee on the general and education trust funds (Chapter 141).</w:t>
-      </w:r>
-    </w:p>
-    <w:p>
-      <w:pPr>
+        <w:t xml:space="preserve">quarterly public reports on the general and education trust funds (Chapter 141).</w:t>
+      </w:r>
+    </w:p>
+    <w:p>
+      <w:pPr>
+        <w:widowControl/>
         <w:spacing w:after="80"/>
         <w:ind w:left="200" w:firstLine="0"/>
         <w:rPr/>
@@ -3987,11 +4036,12 @@
           <w:szCs w:val="20"/>
           <w:rtl w:val="0"/>
         </w:rPr>
-        <w:t xml:space="preserve">school monitoring and financial reports sent to school boards and authorities.</w:t>
-      </w:r>
-    </w:p>
-    <w:p>
-      <w:pPr>
+        <w:t xml:space="preserve">school monitoring and financial reports to school boards and authorities.</w:t>
+      </w:r>
+    </w:p>
+    <w:p>
+      <w:pPr>
+        <w:keepNext/>
         <w:spacing w:before="70" w:after="30" w:line="250" w:lineRule="auto"/>
         <w:rPr/>
       </w:pPr>
@@ -4010,6 +4060,7 @@
     </w:p>
     <w:p>
       <w:pPr>
+        <w:widowControl/>
         <w:spacing w:after="80"/>
         <w:ind w:left="200" w:firstLine="0"/>
         <w:rPr/>
@@ -4044,11 +4095,12 @@
           <w:szCs w:val="20"/>
           <w:rtl w:val="0"/>
         </w:rPr>
-        <w:t xml:space="preserve">tax impact statements on warrant articles — HB138's twin; passed the House 198–160 and was killed on the Senate floor.</w:t>
-      </w:r>
-    </w:p>
-    <w:p>
-      <w:pPr>
+        <w:t xml:space="preserve">tax impact statements — HB138's twin; passed the House 198–160, killed on the Senate floor.</w:t>
+      </w:r>
+    </w:p>
+    <w:p>
+      <w:pPr>
+        <w:widowControl/>
         <w:spacing w:after="80"/>
         <w:ind w:left="200" w:firstLine="0"/>
         <w:rPr/>
@@ -4088,6 +4140,7 @@
     </w:p>
     <w:p>
       <w:pPr>
+        <w:widowControl/>
         <w:spacing w:after="80"/>
         <w:ind w:left="200" w:firstLine="0"/>
         <w:rPr/>
@@ -4127,6 +4180,7 @@
     </w:p>
     <w:p>
       <w:pPr>
+        <w:widowControl/>
         <w:spacing w:after="80"/>
         <w:ind w:left="200" w:firstLine="0"/>
         <w:rPr/>
@@ -4166,6 +4220,7 @@
     </w:p>
     <w:p>
       <w:pPr>
+        <w:widowControl/>
         <w:spacing w:after="80"/>
         <w:ind w:left="200" w:firstLine="0"/>
         <w:rPr/>
@@ -4205,6 +4260,7 @@
     </w:p>
     <w:p>
       <w:pPr>
+        <w:widowControl/>
         <w:spacing w:after="80"/>
         <w:ind w:left="200" w:firstLine="0"/>
         <w:rPr/>
@@ -4244,6 +4300,7 @@
     </w:p>
     <w:p>
       <w:pPr>
+        <w:widowControl/>
         <w:spacing w:after="80"/>
         <w:ind w:left="200" w:firstLine="0"/>
         <w:rPr/>
@@ -4283,6 +4340,7 @@
     </w:p>
     <w:p>
       <w:pPr>
+        <w:widowControl/>
         <w:spacing w:after="80"/>
         <w:ind w:left="200" w:firstLine="0"/>
         <w:rPr/>
@@ -4322,6 +4380,7 @@
     </w:p>
     <w:p>
       <w:pPr>
+        <w:widowControl/>
         <w:spacing w:after="80"/>
         <w:ind w:left="200" w:firstLine="0"/>
         <w:rPr/>
@@ -4361,6 +4420,7 @@
     </w:p>
     <w:p>
       <w:pPr>
+        <w:widowControl/>
         <w:spacing w:after="80"/>
         <w:ind w:left="200" w:firstLine="0"/>
         <w:rPr/>
@@ -4400,6 +4460,7 @@
     </w:p>
     <w:p>
       <w:pPr>
+        <w:widowControl/>
         <w:spacing w:after="80"/>
         <w:ind w:left="200" w:firstLine="0"/>
         <w:rPr/>
@@ -4439,6 +4500,19 @@
     </w:p>
     <w:p>
       <w:pPr>
+        <w:pBdr>
+          <w:top w:color="c8cdd6" w:space="4" w:sz="6" w:val="single"/>
+        </w:pBdr>
+        <w:spacing w:before="40" w:after="0" w:line="276" w:lineRule="auto"/>
+        <w:rPr/>
+      </w:pPr>
+    </w:p>
+    <w:p>
+      <w:pPr>
+        <w:keepNext/>
+        <w:pageBreakBefore/>
+        <w:spacing w:before="100" w:after="40" w:line="276" w:lineRule="auto"/>
+        <w:rPr/>
         <w:sectPr>
           <w:footerReference r:id="rId7" w:type="default"/>
           <w:pgSz w:h="15840" w:w="12240" w:orient="portrait"/>
@@ -4446,12 +4520,6 @@
           <w:pgNumType w:start="1"/>
         </w:sectPr>
       </w:pPr>
-    </w:p>
-    <w:p>
-      <w:pPr>
-        <w:spacing w:before="84" w:after="36" w:line="254" w:lineRule="auto"/>
-        <w:rPr/>
-      </w:pPr>
       <w:r>
         <w:rPr>
           <w:rFonts w:ascii="Arial" w:cs="Arial" w:eastAsia="Arial" w:hAnsi="Arial"/>
@@ -4489,17 +4557,17 @@
           <w:szCs w:val="20"/>
           <w:rtl w:val="0"/>
         </w:rPr>
-        <w:t xml:space="preserve">Abatement:</w:t>
-      </w:r>
-      <w:r>
-        <w:rPr>
-          <w:rFonts w:ascii="Arial" w:cs="Arial" w:eastAsia="Arial" w:hAnsi="Arial"/>
-          <w:color w:val="444444"/>
-          <w:sz w:val="20"/>
-          <w:szCs w:val="20"/>
-          <w:rtl w:val="0"/>
-        </w:rPr>
-        <w:t xml:space="preserve"> The process for correcting an individual property tax bill — homeowners apply to the town, then may appeal to the Board of Tax and Land Appeals or court. A 2024 law (HB202) rewrote the rules; a 2022 law (SB317) cut the interest the state pays back.</w:t>
+        <w:t xml:space="preserve">Adequate education / adequacy grants:</w:t>
+      </w:r>
+      <w:r>
+        <w:rPr>
+          <w:rFonts w:ascii="Arial" w:cs="Arial" w:eastAsia="Arial" w:hAnsi="Arial"/>
+          <w:color w:val="444444"/>
+          <w:sz w:val="20"/>
+          <w:szCs w:val="20"/>
+          <w:rtl w:val="0"/>
+        </w:rPr>
+        <w:t xml:space="preserve"> The state's per-pupil school aid — a base amount ($4,100 since the 2023 budget) plus add-ons for poverty, special education, and English learners.</w:t>
       </w:r>
     </w:p>
     <w:p>
@@ -4526,17 +4594,17 @@
           <w:szCs w:val="20"/>
           <w:rtl w:val="0"/>
         </w:rPr>
-        <w:t xml:space="preserve">Adequate education / adequacy grants:</w:t>
-      </w:r>
-      <w:r>
-        <w:rPr>
-          <w:rFonts w:ascii="Arial" w:cs="Arial" w:eastAsia="Arial" w:hAnsi="Arial"/>
-          <w:color w:val="444444"/>
-          <w:sz w:val="20"/>
-          <w:szCs w:val="20"/>
-          <w:rtl w:val="0"/>
-        </w:rPr>
-        <w:t xml:space="preserve"> The state's per-pupil school aid, built on a base amount ($4,100 since the 2023 budget) plus add-ons for poverty, special education, and English learners.</w:t>
+        <w:t xml:space="preserve">BET (business enterprise tax):</w:t>
+      </w:r>
+      <w:r>
+        <w:rPr>
+          <w:rFonts w:ascii="Arial" w:cs="Arial" w:eastAsia="Arial" w:hAnsi="Arial"/>
+          <w:color w:val="444444"/>
+          <w:sz w:val="20"/>
+          <w:szCs w:val="20"/>
+          <w:rtl w:val="0"/>
+        </w:rPr>
+        <w:t xml:space="preserve"> A 0.55 percent tax on wages, interest, and dividends businesses pay out — cut from 0.675 percent in 2021. A 2026 repeal bill died.</w:t>
       </w:r>
     </w:p>
     <w:p>
@@ -4563,17 +4631,17 @@
           <w:szCs w:val="20"/>
           <w:rtl w:val="0"/>
         </w:rPr>
-        <w:t xml:space="preserve">BET (business enterprise tax):</w:t>
-      </w:r>
-      <w:r>
-        <w:rPr>
-          <w:rFonts w:ascii="Arial" w:cs="Arial" w:eastAsia="Arial" w:hAnsi="Arial"/>
-          <w:color w:val="444444"/>
-          <w:sz w:val="20"/>
-          <w:szCs w:val="20"/>
-          <w:rtl w:val="0"/>
-        </w:rPr>
-        <w:t xml:space="preserve"> A 0.55 percent tax on wages, interest, and dividends businesses pay out — cut from 0.675 percent in the 2021 budget. A 2026 repeal bill died.</w:t>
+        <w:t xml:space="preserve">BPT (business profits tax):</w:t>
+      </w:r>
+      <w:r>
+        <w:rPr>
+          <w:rFonts w:ascii="Arial" w:cs="Arial" w:eastAsia="Arial" w:hAnsi="Arial"/>
+          <w:color w:val="444444"/>
+          <w:sz w:val="20"/>
+          <w:szCs w:val="20"/>
+          <w:rtl w:val="0"/>
+        </w:rPr>
+        <w:t xml:space="preserve"> The state's main business tax and largest tax source, 7.5 percent of profits — cut from 7.7 in 2021 and again in 2022.</w:t>
       </w:r>
     </w:p>
     <w:p>
@@ -4600,17 +4668,17 @@
           <w:szCs w:val="20"/>
           <w:rtl w:val="0"/>
         </w:rPr>
-        <w:t xml:space="preserve">BPT (business profits tax):</w:t>
-      </w:r>
-      <w:r>
-        <w:rPr>
-          <w:rFonts w:ascii="Arial" w:cs="Arial" w:eastAsia="Arial" w:hAnsi="Arial"/>
-          <w:color w:val="444444"/>
-          <w:sz w:val="20"/>
-          <w:szCs w:val="20"/>
-          <w:rtl w:val="0"/>
-        </w:rPr>
-        <w:t xml:space="preserve"> The state's main business tax, 7.5 percent of profits — cut from 7.7 in 2021 and again in 2022. The state's largest tax source.</w:t>
+        <w:t xml:space="preserve">Claremont / ConVal:</w:t>
+      </w:r>
+      <w:r>
+        <w:rPr>
+          <w:rFonts w:ascii="Arial" w:cs="Arial" w:eastAsia="Arial" w:hAnsi="Arial"/>
+          <w:color w:val="444444"/>
+          <w:sz w:val="20"/>
+          <w:szCs w:val="20"/>
+          <w:rtl w:val="0"/>
+        </w:rPr>
+        <w:t xml:space="preserve"> The school-funding court cases: Claremont (1990s) made the state responsible for funding an adequate education; ConVal (ongoing) challenges whether current amounts and the SWEPT meet that duty.</w:t>
       </w:r>
     </w:p>
     <w:p>
@@ -4637,17 +4705,17 @@
           <w:szCs w:val="20"/>
           <w:rtl w:val="0"/>
         </w:rPr>
-        <w:t xml:space="preserve">Board of Tax and Land Appeals (BTLA):</w:t>
-      </w:r>
-      <w:r>
-        <w:rPr>
-          <w:rFonts w:ascii="Arial" w:cs="Arial" w:eastAsia="Arial" w:hAnsi="Arial"/>
-          <w:color w:val="444444"/>
-          <w:sz w:val="20"/>
-          <w:szCs w:val="20"/>
-          <w:rtl w:val="0"/>
-        </w:rPr>
-        <w:t xml:space="preserve"> The state board that hears property tax abatement appeals as an alternative to court.</w:t>
+        <w:t xml:space="preserve">Cooperative school district:</w:t>
+      </w:r>
+      <w:r>
+        <w:rPr>
+          <w:rFonts w:ascii="Arial" w:cs="Arial" w:eastAsia="Arial" w:hAnsi="Arial"/>
+          <w:color w:val="444444"/>
+          <w:sz w:val="20"/>
+          <w:szCs w:val="20"/>
+          <w:rtl w:val="0"/>
+        </w:rPr>
+        <w:t xml:space="preserve"> A district formed by several towns sharing schools and apportioning costs; withdrawal procedures were rewritten in 2023 and 2026.</w:t>
       </w:r>
     </w:p>
     <w:p>
@@ -4674,17 +4742,17 @@
           <w:szCs w:val="20"/>
           <w:rtl w:val="0"/>
         </w:rPr>
-        <w:t xml:space="preserve">Claremont / ConVal:</w:t>
-      </w:r>
-      <w:r>
-        <w:rPr>
-          <w:rFonts w:ascii="Arial" w:cs="Arial" w:eastAsia="Arial" w:hAnsi="Arial"/>
-          <w:color w:val="444444"/>
-          <w:sz w:val="20"/>
-          <w:szCs w:val="20"/>
-          <w:rtl w:val="0"/>
-        </w:rPr>
-        <w:t xml:space="preserve"> The school-funding court cases. Claremont (1990s) made the state responsible for funding an adequate education; ConVal (ongoing) challenges whether current amounts and the SWEPT meet that duty.</w:t>
+        <w:t xml:space="preserve">Current use:</w:t>
+      </w:r>
+      <w:r>
+        <w:rPr>
+          <w:rFonts w:ascii="Arial" w:cs="Arial" w:eastAsia="Arial" w:hAnsi="Arial"/>
+          <w:color w:val="444444"/>
+          <w:sz w:val="20"/>
+          <w:szCs w:val="20"/>
+          <w:rtl w:val="0"/>
+        </w:rPr>
+        <w:t xml:space="preserve"> Farm, forest, and open land taxed on its productive value rather than market value; leaving current use triggers the land use change tax.</w:t>
       </w:r>
     </w:p>
     <w:p>
@@ -4711,17 +4779,17 @@
           <w:szCs w:val="20"/>
           <w:rtl w:val="0"/>
         </w:rPr>
-        <w:t xml:space="preserve">Communications services tax:</w:t>
-      </w:r>
-      <w:r>
-        <w:rPr>
-          <w:rFonts w:ascii="Arial" w:cs="Arial" w:eastAsia="Arial" w:hAnsi="Arial"/>
-          <w:color w:val="444444"/>
-          <w:sz w:val="20"/>
-          <w:szCs w:val="20"/>
-          <w:rtl w:val="0"/>
-        </w:rPr>
-        <w:t xml:space="preserve"> The 7 percent tax on phone and communications service; repeal bills have reached interim study four times (2022–2026).</w:t>
+        <w:t xml:space="preserve">Donor town / excess SWEPT:</w:t>
+      </w:r>
+      <w:r>
+        <w:rPr>
+          <w:rFonts w:ascii="Arial" w:cs="Arial" w:eastAsia="Arial" w:hAnsi="Arial"/>
+          <w:color w:val="444444"/>
+          <w:sz w:val="20"/>
+          <w:szCs w:val="20"/>
+          <w:rtl w:val="0"/>
+        </w:rPr>
+        <w:t xml:space="preserve"> A town whose statewide education property tax collections exceed its state-computed school cost; whether it keeps the excess (current law) or remits it is the recurring fight.</w:t>
       </w:r>
     </w:p>
     <w:p>
@@ -4748,17 +4816,17 @@
           <w:szCs w:val="20"/>
           <w:rtl w:val="0"/>
         </w:rPr>
-        <w:t xml:space="preserve">Cooperative school district:</w:t>
-      </w:r>
-      <w:r>
-        <w:rPr>
-          <w:rFonts w:ascii="Arial" w:cs="Arial" w:eastAsia="Arial" w:hAnsi="Arial"/>
-          <w:color w:val="444444"/>
-          <w:sz w:val="20"/>
-          <w:szCs w:val="20"/>
-          <w:rtl w:val="0"/>
-        </w:rPr>
-        <w:t xml:space="preserve"> A district formed by several towns sharing schools and apportioning costs; withdrawal procedures were rewritten in 2023 and 2026.</w:t>
+        <w:t xml:space="preserve">Education freedom accounts (EFAs):</w:t>
+      </w:r>
+      <w:r>
+        <w:rPr>
+          <w:rFonts w:ascii="Arial" w:cs="Arial" w:eastAsia="Arial" w:hAnsi="Arial"/>
+          <w:color w:val="444444"/>
+          <w:sz w:val="20"/>
+          <w:szCs w:val="20"/>
+          <w:rtl w:val="0"/>
+        </w:rPr>
+        <w:t xml:space="preserve"> State adequacy money following students out of public schools, paid from the education trust fund since the 2021 budget.</w:t>
       </w:r>
     </w:p>
     <w:p>
@@ -4785,17 +4853,17 @@
           <w:szCs w:val="20"/>
           <w:rtl w:val="0"/>
         </w:rPr>
-        <w:t xml:space="preserve">Current use:</w:t>
-      </w:r>
-      <w:r>
-        <w:rPr>
-          <w:rFonts w:ascii="Arial" w:cs="Arial" w:eastAsia="Arial" w:hAnsi="Arial"/>
-          <w:color w:val="444444"/>
-          <w:sz w:val="20"/>
-          <w:szCs w:val="20"/>
-          <w:rtl w:val="0"/>
-        </w:rPr>
-        <w:t xml:space="preserve"> Farm, forest, and open land taxed on its productive value rather than market value (RSA 79-A); leaving current use triggers the land use change tax.</w:t>
+        <w:t xml:space="preserve">Education trust fund:</w:t>
+      </w:r>
+      <w:r>
+        <w:rPr>
+          <w:rFonts w:ascii="Arial" w:cs="Arial" w:eastAsia="Arial" w:hAnsi="Arial"/>
+          <w:color w:val="444444"/>
+          <w:sz w:val="20"/>
+          <w:szCs w:val="20"/>
+          <w:rtl w:val="0"/>
+        </w:rPr>
+        <w:t xml:space="preserve"> The dedicated fund that pays adequacy grants and homeowner relief — fed by fixed shares of the business taxes (39 percent since 2025), tobacco, transfer tax, lottery, and SWEPT.</w:t>
       </w:r>
     </w:p>
     <w:p>
@@ -4822,17 +4890,17 @@
           <w:szCs w:val="20"/>
           <w:rtl w:val="0"/>
         </w:rPr>
-        <w:t xml:space="preserve">Donor town / excess SWEPT:</w:t>
-      </w:r>
-      <w:r>
-        <w:rPr>
-          <w:rFonts w:ascii="Arial" w:cs="Arial" w:eastAsia="Arial" w:hAnsi="Arial"/>
-          <w:color w:val="444444"/>
-          <w:sz w:val="20"/>
-          <w:szCs w:val="20"/>
-          <w:rtl w:val="0"/>
-        </w:rPr>
-        <w:t xml:space="preserve"> A town whose statewide education property tax collections exceed its state-computed school cost; whether it keeps the excess (current law) or remits it is the recurring fight (HB1686 2024, HB675 2025).</w:t>
+        <w:t xml:space="preserve">Exemption vs. credit:</w:t>
+      </w:r>
+      <w:r>
+        <w:rPr>
+          <w:rFonts w:ascii="Arial" w:cs="Arial" w:eastAsia="Arial" w:hAnsi="Arial"/>
+          <w:color w:val="444444"/>
+          <w:sz w:val="20"/>
+          <w:szCs w:val="20"/>
+          <w:rtl w:val="0"/>
+        </w:rPr>
+        <w:t xml:space="preserve"> An exemption reduces a property's taxable value; a credit reduces the tax bill itself (veterans' credits are credits; the elderly exemption is an exemption).</w:t>
       </w:r>
     </w:p>
     <w:p>
@@ -4859,17 +4927,17 @@
           <w:szCs w:val="20"/>
           <w:rtl w:val="0"/>
         </w:rPr>
-        <w:t xml:space="preserve">Education freedom accounts (EFAs):</w:t>
-      </w:r>
-      <w:r>
-        <w:rPr>
-          <w:rFonts w:ascii="Arial" w:cs="Arial" w:eastAsia="Arial" w:hAnsi="Arial"/>
-          <w:color w:val="444444"/>
-          <w:sz w:val="20"/>
-          <w:szCs w:val="20"/>
-          <w:rtl w:val="0"/>
-        </w:rPr>
-        <w:t xml:space="preserve"> State adequacy money following students out of public schools, paid from the education trust fund since the 2021 budget.</w:t>
+        <w:t xml:space="preserve">Fiscal capacity disparity aid:</w:t>
+      </w:r>
+      <w:r>
+        <w:rPr>
+          <w:rFonts w:ascii="Arial" w:cs="Arial" w:eastAsia="Arial" w:hAnsi="Arial"/>
+          <w:color w:val="444444"/>
+          <w:sz w:val="20"/>
+          <w:szCs w:val="20"/>
+          <w:rtl w:val="0"/>
+        </w:rPr>
+        <w:t xml:space="preserve"> Extra school aid (HB2 2025) for towns with low equalized property value per pupil — up to $1,250 per pupil.</w:t>
       </w:r>
     </w:p>
     <w:p>
@@ -4896,17 +4964,17 @@
           <w:szCs w:val="20"/>
           <w:rtl w:val="0"/>
         </w:rPr>
-        <w:t xml:space="preserve">Education trust fund:</w:t>
-      </w:r>
-      <w:r>
-        <w:rPr>
-          <w:rFonts w:ascii="Arial" w:cs="Arial" w:eastAsia="Arial" w:hAnsi="Arial"/>
-          <w:color w:val="444444"/>
-          <w:sz w:val="20"/>
-          <w:szCs w:val="20"/>
-          <w:rtl w:val="0"/>
-        </w:rPr>
-        <w:t xml:space="preserve"> The dedicated fund that pays adequacy grants and homeowner relief — fed by fixed shares of the business taxes (39 percent since 2025), tobacco, transfer tax, lottery, and SWEPT.</w:t>
+        <w:t xml:space="preserve">Homestead exemption (proposal):</w:t>
+      </w:r>
+      <w:r>
+        <w:rPr>
+          <w:rFonts w:ascii="Arial" w:cs="Arial" w:eastAsia="Arial" w:hAnsi="Arial"/>
+          <w:color w:val="444444"/>
+          <w:sz w:val="20"/>
+          <w:szCs w:val="20"/>
+          <w:rtl w:val="0"/>
+        </w:rPr>
+        <w:t xml:space="preserve"> Taxing owner-occupied primary homes on less than full value — a local option in every version filed here. Distinct from the existing homestead right, which protects home equity from creditors and has nothing to do with taxes.</w:t>
       </w:r>
     </w:p>
     <w:p>
@@ -4933,17 +5001,17 @@
           <w:szCs w:val="20"/>
           <w:rtl w:val="0"/>
         </w:rPr>
-        <w:t xml:space="preserve">Equalization:</w:t>
-      </w:r>
-      <w:r>
-        <w:rPr>
-          <w:rFonts w:ascii="Arial" w:cs="Arial" w:eastAsia="Arial" w:hAnsi="Arial"/>
-          <w:color w:val="444444"/>
-          <w:sz w:val="20"/>
-          <w:szCs w:val="20"/>
-          <w:rtl w:val="0"/>
-        </w:rPr>
-        <w:t xml:space="preserve"> The state's annual adjustment making town assessments comparable, so shared taxes and aid formulas treat towns fairly; the equalization manual entered state rules in 2023.</w:t>
+        <w:t xml:space="preserve">Interest and dividends (I&amp;D) tax:</w:t>
+      </w:r>
+      <w:r>
+        <w:rPr>
+          <w:rFonts w:ascii="Arial" w:cs="Arial" w:eastAsia="Arial" w:hAnsi="Arial"/>
+          <w:color w:val="444444"/>
+          <w:sz w:val="20"/>
+          <w:szCs w:val="20"/>
+          <w:rtl w:val="0"/>
+        </w:rPr>
+        <w:t xml:space="preserve"> The 5 percent tax on investment income, phased down from 2023 and repealed January 1, 2025 through the budget trailers.</w:t>
       </w:r>
     </w:p>
     <w:p>
@@ -4970,17 +5038,17 @@
           <w:szCs w:val="20"/>
           <w:rtl w:val="0"/>
         </w:rPr>
-        <w:t xml:space="preserve">Exemption vs. credit:</w:t>
-      </w:r>
-      <w:r>
-        <w:rPr>
-          <w:rFonts w:ascii="Arial" w:cs="Arial" w:eastAsia="Arial" w:hAnsi="Arial"/>
-          <w:color w:val="444444"/>
-          <w:sz w:val="20"/>
-          <w:szCs w:val="20"/>
-          <w:rtl w:val="0"/>
-        </w:rPr>
-        <w:t xml:space="preserve"> An exemption reduces a property's taxable value; a credit reduces the tax bill itself (the veterans' credits are credits; the elderly exemption is an exemption).</w:t>
+        <w:t xml:space="preserve">Low and moderate income homeowners property tax relief:</w:t>
+      </w:r>
+      <w:r>
+        <w:rPr>
+          <w:rFonts w:ascii="Arial" w:cs="Arial" w:eastAsia="Arial" w:hAnsi="Arial"/>
+          <w:color w:val="444444"/>
+          <w:sz w:val="20"/>
+          <w:szCs w:val="20"/>
+          <w:rtl w:val="0"/>
+        </w:rPr>
+        <w:t xml:space="preserve"> The state's existing rebate of part of the SWEPT for lower-income homeowners; eligibility was widened in 2021.</w:t>
       </w:r>
     </w:p>
     <w:p>
@@ -5007,17 +5075,17 @@
           <w:szCs w:val="20"/>
           <w:rtl w:val="0"/>
         </w:rPr>
-        <w:t xml:space="preserve">Fiscal capacity disparity aid:</w:t>
-      </w:r>
-      <w:r>
-        <w:rPr>
-          <w:rFonts w:ascii="Arial" w:cs="Arial" w:eastAsia="Arial" w:hAnsi="Arial"/>
-          <w:color w:val="444444"/>
-          <w:sz w:val="20"/>
-          <w:szCs w:val="20"/>
-          <w:rtl w:val="0"/>
-        </w:rPr>
-        <w:t xml:space="preserve"> Extra school aid (HB2 2025) for towns with low equalized property value per pupil — up to $1,250 per pupil.</w:t>
+        <w:t xml:space="preserve">Meals and rooms tax:</w:t>
+      </w:r>
+      <w:r>
+        <w:rPr>
+          <w:rFonts w:ascii="Arial" w:cs="Arial" w:eastAsia="Arial" w:hAnsi="Arial"/>
+          <w:color w:val="444444"/>
+          <w:sz w:val="20"/>
+          <w:szCs w:val="20"/>
+          <w:rtl w:val="0"/>
+        </w:rPr>
+        <w:t xml:space="preserve"> The 8.5 percent tax on meals, room rentals, and vehicle rentals (9 percent before October 2021); a share flows to every town through the municipal revenue fund created in the 2021 budget.</w:t>
       </w:r>
     </w:p>
     <w:p>
@@ -5044,17 +5112,17 @@
           <w:szCs w:val="20"/>
           <w:rtl w:val="0"/>
         </w:rPr>
-        <w:t xml:space="preserve">Homestead exemption (proposal):</w:t>
-      </w:r>
-      <w:r>
-        <w:rPr>
-          <w:rFonts w:ascii="Arial" w:cs="Arial" w:eastAsia="Arial" w:hAnsi="Arial"/>
-          <w:color w:val="444444"/>
-          <w:sz w:val="20"/>
-          <w:szCs w:val="20"/>
-          <w:rtl w:val="0"/>
-        </w:rPr>
-        <w:t xml:space="preserve"> Taxing owner-occupied primary homes on less than full value — a local option in every version filed here. Distinct from the existing homestead right, which protects home equity from creditors and has nothing to do with taxes.</w:t>
+        <w:t xml:space="preserve">PILOT (payment in lieu of taxes):</w:t>
+      </w:r>
+      <w:r>
+        <w:rPr>
+          <w:rFonts w:ascii="Arial" w:cs="Arial" w:eastAsia="Arial" w:hAnsi="Arial"/>
+          <w:color w:val="444444"/>
+          <w:sz w:val="20"/>
+          <w:szCs w:val="20"/>
+          <w:rtl w:val="0"/>
+        </w:rPr>
+        <w:t xml:space="preserve"> Negotiated payments from tax-exempt property owners; renewable-energy PILOT agreements were enabled in 2021.</w:t>
       </w:r>
     </w:p>
     <w:p>
@@ -5081,17 +5149,17 @@
           <w:szCs w:val="20"/>
           <w:rtl w:val="0"/>
         </w:rPr>
-        <w:t xml:space="preserve">Interest and dividends (I&amp;D) tax:</w:t>
-      </w:r>
-      <w:r>
-        <w:rPr>
-          <w:rFonts w:ascii="Arial" w:cs="Arial" w:eastAsia="Arial" w:hAnsi="Arial"/>
-          <w:color w:val="444444"/>
-          <w:sz w:val="20"/>
-          <w:szCs w:val="20"/>
-          <w:rtl w:val="0"/>
-        </w:rPr>
-        <w:t xml:space="preserve"> The 5 percent tax on investment income, phased down from 2023 and repealed January 1, 2025 through the budget trailers.</w:t>
+        <w:t xml:space="preserve">Revenue sharing (RSA 31-A):</w:t>
+      </w:r>
+      <w:r>
+        <w:rPr>
+          <w:rFonts w:ascii="Arial" w:cs="Arial" w:eastAsia="Arial" w:hAnsi="Arial"/>
+          <w:color w:val="444444"/>
+          <w:sz w:val="20"/>
+          <w:szCs w:val="20"/>
+          <w:rtl w:val="0"/>
+        </w:rPr>
+        <w:t xml:space="preserve"> The general-fund aid statute for cities and towns — suspended in every budget since 2010, repealed outright by HB2 2025.</w:t>
       </w:r>
     </w:p>
     <w:p>
@@ -5118,17 +5186,17 @@
           <w:szCs w:val="20"/>
           <w:rtl w:val="0"/>
         </w:rPr>
-        <w:t xml:space="preserve">Low and moderate income homeowners property tax relief:</w:t>
-      </w:r>
-      <w:r>
-        <w:rPr>
-          <w:rFonts w:ascii="Arial" w:cs="Arial" w:eastAsia="Arial" w:hAnsi="Arial"/>
-          <w:color w:val="444444"/>
-          <w:sz w:val="20"/>
-          <w:szCs w:val="20"/>
-          <w:rtl w:val="0"/>
-        </w:rPr>
-        <w:t xml:space="preserve"> The state's existing rebate of part of the statewide education property tax for lower-income homeowners; eligibility was widened in 2021 (HB486).</w:t>
+        <w:t xml:space="preserve">SWEPT (statewide education property tax):</w:t>
+      </w:r>
+      <w:r>
+        <w:rPr>
+          <w:rFonts w:ascii="Arial" w:cs="Arial" w:eastAsia="Arial" w:hAnsi="Arial"/>
+          <w:color w:val="444444"/>
+          <w:sz w:val="20"/>
+          <w:szCs w:val="20"/>
+          <w:rtl w:val="0"/>
+        </w:rPr>
+        <w:t xml:space="preserve"> The $363 million property tax the state requires towns to raise and keep for their schools — counted as state aid, collected locally. Every structural change to it died in 2023–2026.</w:t>
       </w:r>
     </w:p>
     <w:p>
@@ -5155,17 +5223,17 @@
           <w:szCs w:val="20"/>
           <w:rtl w:val="0"/>
         </w:rPr>
-        <w:t xml:space="preserve">Meals and rooms tax:</w:t>
-      </w:r>
-      <w:r>
-        <w:rPr>
-          <w:rFonts w:ascii="Arial" w:cs="Arial" w:eastAsia="Arial" w:hAnsi="Arial"/>
-          <w:color w:val="444444"/>
-          <w:sz w:val="20"/>
-          <w:szCs w:val="20"/>
-          <w:rtl w:val="0"/>
-        </w:rPr>
-        <w:t xml:space="preserve"> The 8.5 percent tax on restaurant meals, room rentals, and vehicle rentals (9 percent before October 2021); a share flows to every town through the municipal revenue fund created in the 2021 budget.</w:t>
+        <w:t xml:space="preserve">Tax cap:</w:t>
+      </w:r>
+      <w:r>
+        <w:rPr>
+          <w:rFonts w:ascii="Arial" w:cs="Arial" w:eastAsia="Arial" w:hAnsi="Arial"/>
+          <w:color w:val="444444"/>
+          <w:sz w:val="20"/>
+          <w:szCs w:val="20"/>
+          <w:rtl w:val="0"/>
+        </w:rPr>
+        <w:t xml:space="preserve"> A charter or ballot limit on how fast a town, city, or school district budget may grow; cap and budget-cap laws passed in 2021, 2024, 2025, and 2026.</w:t>
       </w:r>
     </w:p>
     <w:p>
@@ -5181,217 +5249,6 @@
           <w:sz w:val="10"/>
           <w:szCs w:val="10"/>
         </w:rPr>
-      </w:pPr>
-      <w:r>
-        <w:rPr>
-          <w:rFonts w:ascii="Arial" w:cs="Arial" w:eastAsia="Arial" w:hAnsi="Arial"/>
-          <w:b w:val="1"/>
-          <w:bCs w:val="1"/>
-          <w:color w:val="1a2d4f"/>
-          <w:sz w:val="20"/>
-          <w:szCs w:val="20"/>
-          <w:rtl w:val="0"/>
-        </w:rPr>
-        <w:t xml:space="preserve">PILOT (payment in lieu of taxes):</w:t>
-      </w:r>
-      <w:r>
-        <w:rPr>
-          <w:rFonts w:ascii="Arial" w:cs="Arial" w:eastAsia="Arial" w:hAnsi="Arial"/>
-          <w:color w:val="444444"/>
-          <w:sz w:val="20"/>
-          <w:szCs w:val="20"/>
-          <w:rtl w:val="0"/>
-        </w:rPr>
-        <w:t xml:space="preserve"> Negotiated payments from tax-exempt property owners; renewable-energy PILOT agreements were enabled in 2021 (HB64).</w:t>
-      </w:r>
-    </w:p>
-    <w:p>
-      <w:pPr>
-        <w:numPr>
-          <w:ilvl w:val="0"/>
-          <w:numId w:val="2"/>
-        </w:numPr>
-        <w:spacing w:after="0" w:afterAutospacing="0" w:line="276" w:lineRule="auto"/>
-        <w:ind w:left="720" w:hanging="360"/>
-        <w:rPr>
-          <w:rFonts w:ascii="Arial" w:cs="Arial" w:eastAsia="Arial" w:hAnsi="Arial"/>
-          <w:sz w:val="10"/>
-          <w:szCs w:val="10"/>
-        </w:rPr>
-      </w:pPr>
-      <w:r>
-        <w:rPr>
-          <w:rFonts w:ascii="Arial" w:cs="Arial" w:eastAsia="Arial" w:hAnsi="Arial"/>
-          <w:b w:val="1"/>
-          <w:bCs w:val="1"/>
-          <w:color w:val="1a2d4f"/>
-          <w:sz w:val="20"/>
-          <w:szCs w:val="20"/>
-          <w:rtl w:val="0"/>
-        </w:rPr>
-        <w:t xml:space="preserve">Rainy day fund (revenue stabilization reserve):</w:t>
-      </w:r>
-      <w:r>
-        <w:rPr>
-          <w:rFonts w:ascii="Arial" w:cs="Arial" w:eastAsia="Arial" w:hAnsi="Arial"/>
-          <w:color w:val="444444"/>
-          <w:sz w:val="20"/>
-          <w:szCs w:val="20"/>
-          <w:rtl w:val="0"/>
-        </w:rPr>
-        <w:t xml:space="preserve"> The state's savings account; its cap rose to 10 percent of general fund revenue in 2021.</w:t>
-      </w:r>
-    </w:p>
-    <w:p>
-      <w:pPr>
-        <w:numPr>
-          <w:ilvl w:val="0"/>
-          <w:numId w:val="2"/>
-        </w:numPr>
-        <w:spacing w:after="0" w:afterAutospacing="0" w:line="276" w:lineRule="auto"/>
-        <w:ind w:left="720" w:hanging="360"/>
-        <w:rPr>
-          <w:rFonts w:ascii="Arial" w:cs="Arial" w:eastAsia="Arial" w:hAnsi="Arial"/>
-          <w:sz w:val="10"/>
-          <w:szCs w:val="10"/>
-        </w:rPr>
-      </w:pPr>
-      <w:r>
-        <w:rPr>
-          <w:rFonts w:ascii="Arial" w:cs="Arial" w:eastAsia="Arial" w:hAnsi="Arial"/>
-          <w:b w:val="1"/>
-          <w:bCs w:val="1"/>
-          <w:color w:val="1a2d4f"/>
-          <w:sz w:val="20"/>
-          <w:szCs w:val="20"/>
-          <w:rtl w:val="0"/>
-        </w:rPr>
-        <w:t xml:space="preserve">Revenue sharing (RSA 31-A):</w:t>
-      </w:r>
-      <w:r>
-        <w:rPr>
-          <w:rFonts w:ascii="Arial" w:cs="Arial" w:eastAsia="Arial" w:hAnsi="Arial"/>
-          <w:color w:val="444444"/>
-          <w:sz w:val="20"/>
-          <w:szCs w:val="20"/>
-          <w:rtl w:val="0"/>
-        </w:rPr>
-        <w:t xml:space="preserve"> The general-fund aid statute for cities and towns — suspended in every budget since 2010, repealed outright by HB2 2025.</w:t>
-      </w:r>
-    </w:p>
-    <w:p>
-      <w:pPr>
-        <w:numPr>
-          <w:ilvl w:val="0"/>
-          <w:numId w:val="2"/>
-        </w:numPr>
-        <w:spacing w:after="0" w:afterAutospacing="0" w:line="276" w:lineRule="auto"/>
-        <w:ind w:left="720" w:hanging="360"/>
-        <w:rPr>
-          <w:rFonts w:ascii="Arial" w:cs="Arial" w:eastAsia="Arial" w:hAnsi="Arial"/>
-          <w:sz w:val="10"/>
-          <w:szCs w:val="10"/>
-        </w:rPr>
-      </w:pPr>
-      <w:r>
-        <w:rPr>
-          <w:rFonts w:ascii="Arial" w:cs="Arial" w:eastAsia="Arial" w:hAnsi="Arial"/>
-          <w:b w:val="1"/>
-          <w:bCs w:val="1"/>
-          <w:color w:val="1a2d4f"/>
-          <w:sz w:val="20"/>
-          <w:szCs w:val="20"/>
-          <w:rtl w:val="0"/>
-        </w:rPr>
-        <w:t xml:space="preserve">School building aid:</w:t>
-      </w:r>
-      <w:r>
-        <w:rPr>
-          <w:rFonts w:ascii="Arial" w:cs="Arial" w:eastAsia="Arial" w:hAnsi="Arial"/>
-          <w:color w:val="444444"/>
-          <w:sz w:val="20"/>
-          <w:szCs w:val="20"/>
-          <w:rtl w:val="0"/>
-        </w:rPr>
-        <w:t xml:space="preserve"> State grants toward school construction; funded at $30 million in 2021, with the program's rules fought over in every session since.</w:t>
-      </w:r>
-    </w:p>
-    <w:p>
-      <w:pPr>
-        <w:numPr>
-          <w:ilvl w:val="0"/>
-          <w:numId w:val="2"/>
-        </w:numPr>
-        <w:spacing w:after="0" w:afterAutospacing="0" w:line="276" w:lineRule="auto"/>
-        <w:ind w:left="720" w:hanging="360"/>
-        <w:rPr>
-          <w:rFonts w:ascii="Arial" w:cs="Arial" w:eastAsia="Arial" w:hAnsi="Arial"/>
-          <w:sz w:val="10"/>
-          <w:szCs w:val="10"/>
-        </w:rPr>
-      </w:pPr>
-      <w:r>
-        <w:rPr>
-          <w:rFonts w:ascii="Arial" w:cs="Arial" w:eastAsia="Arial" w:hAnsi="Arial"/>
-          <w:b w:val="1"/>
-          <w:bCs w:val="1"/>
-          <w:color w:val="1a2d4f"/>
-          <w:sz w:val="20"/>
-          <w:szCs w:val="20"/>
-          <w:rtl w:val="0"/>
-        </w:rPr>
-        <w:t xml:space="preserve">SWEPT (statewide education property tax):</w:t>
-      </w:r>
-      <w:r>
-        <w:rPr>
-          <w:rFonts w:ascii="Arial" w:cs="Arial" w:eastAsia="Arial" w:hAnsi="Arial"/>
-          <w:color w:val="444444"/>
-          <w:sz w:val="20"/>
-          <w:szCs w:val="20"/>
-          <w:rtl w:val="0"/>
-        </w:rPr>
-        <w:t xml:space="preserve"> The $363 million property tax the state requires towns to raise and keep for their schools — counted as state aid, collected locally. Every structural change to it died in 2023–2026.</w:t>
-      </w:r>
-    </w:p>
-    <w:p>
-      <w:pPr>
-        <w:numPr>
-          <w:ilvl w:val="0"/>
-          <w:numId w:val="2"/>
-        </w:numPr>
-        <w:spacing w:after="0" w:afterAutospacing="0" w:line="276" w:lineRule="auto"/>
-        <w:ind w:left="720" w:hanging="360"/>
-        <w:rPr>
-          <w:rFonts w:ascii="Arial" w:cs="Arial" w:eastAsia="Arial" w:hAnsi="Arial"/>
-          <w:sz w:val="10"/>
-          <w:szCs w:val="10"/>
-        </w:rPr>
-      </w:pPr>
-      <w:r>
-        <w:rPr>
-          <w:rFonts w:ascii="Arial" w:cs="Arial" w:eastAsia="Arial" w:hAnsi="Arial"/>
-          <w:b w:val="1"/>
-          <w:bCs w:val="1"/>
-          <w:color w:val="1a2d4f"/>
-          <w:sz w:val="20"/>
-          <w:szCs w:val="20"/>
-          <w:rtl w:val="0"/>
-        </w:rPr>
-        <w:t xml:space="preserve">Tax cap:</w:t>
-      </w:r>
-      <w:r>
-        <w:rPr>
-          <w:rFonts w:ascii="Arial" w:cs="Arial" w:eastAsia="Arial" w:hAnsi="Arial"/>
-          <w:color w:val="444444"/>
-          <w:sz w:val="20"/>
-          <w:szCs w:val="20"/>
-          <w:rtl w:val="0"/>
-        </w:rPr>
-        <w:t xml:space="preserve"> A charter or ballot limit on how fast a town, city, or school district budget may grow; cap and budget-cap laws passed in 2021, 2024, 2025 (three, including SB105's town budget caps), and 2026.</w:t>
-      </w:r>
-    </w:p>
-    <w:p>
-      <w:pPr>
         <w:sectPr>
           <w:type w:val="continuous"/>
           <w:pgSz w:h="15840" w:w="12240" w:orient="portrait"/>
@@ -5402,6 +5259,52 @@
           </w:cols>
         </w:sectPr>
       </w:pPr>
+      <w:r>
+        <w:rPr>
+          <w:rFonts w:ascii="Arial" w:cs="Arial" w:eastAsia="Arial" w:hAnsi="Arial"/>
+          <w:b w:val="1"/>
+          <w:bCs w:val="1"/>
+          <w:color w:val="1a2d4f"/>
+          <w:sz w:val="20"/>
+          <w:szCs w:val="20"/>
+          <w:rtl w:val="0"/>
+        </w:rPr>
+        <w:t xml:space="preserve">Video lottery terminals (VLTs):</w:t>
+      </w:r>
+      <w:r>
+        <w:rPr>
+          <w:rFonts w:ascii="Arial" w:cs="Arial" w:eastAsia="Arial" w:hAnsi="Arial"/>
+          <w:color w:val="444444"/>
+          <w:sz w:val="20"/>
+          <w:szCs w:val="20"/>
+          <w:rtl w:val="0"/>
+        </w:rPr>
+        <w:t xml:space="preserve"> Slot-style machines legalized by HB2 2025 at charitable gaming facilities — 31 percent of machine revenue goes to the state, and SB83 routes state money to reimburse town exemptions.</w:t>
+      </w:r>
+    </w:p>
+    <w:p>
+      <w:pPr>
+        <w:keepNext/>
+        <w:spacing w:before="100" w:after="40" w:line="276" w:lineRule="auto"/>
+        <w:rPr/>
+        <w:sectPr>
+          <w:type w:val="nextPage"/>
+          <w:pgSz w:h="15840" w:w="12240" w:orient="portrait"/>
+          <w:pgMar w:bottom="864" w:top="864" w:left="864" w:right="864" w:header="720" w:footer="720"/>
+        </w:sectPr>
+      </w:pPr>
+      <w:r>
+        <w:rPr>
+          <w:rFonts w:ascii="Arial" w:cs="Arial" w:eastAsia="Arial" w:hAnsi="Arial"/>
+          <w:b w:val="1"/>
+          <w:bCs w:val="1"/>
+          <w:color w:val="c0392b"/>
+          <w:sz w:val="25"/>
+          <w:szCs w:val="25"/>
+          <w:rtl w:val="0"/>
+        </w:rPr>
+        <w:t xml:space="preserve">LEGISLATIVE PROCESS GLOSSARY</w:t>
+      </w:r>
     </w:p>
     <w:p>
       <w:pPr>
@@ -5427,44 +5330,17 @@
           <w:szCs w:val="20"/>
           <w:rtl w:val="0"/>
         </w:rPr>
-        <w:t xml:space="preserve">Video lottery terminals (VLTs):</w:t>
-      </w:r>
-      <w:r>
-        <w:rPr>
-          <w:rFonts w:ascii="Arial" w:cs="Arial" w:eastAsia="Arial" w:hAnsi="Arial"/>
-          <w:color w:val="444444"/>
-          <w:sz w:val="20"/>
-          <w:szCs w:val="20"/>
-          <w:rtl w:val="0"/>
-        </w:rPr>
-        <w:t xml:space="preserve"> Slot-style machines legalized by HB2 2025 at charitable gaming facilities — 31 percent of machine revenue goes to the state, and SB83 routes state money to reimburse town exemptions.</w:t>
-      </w:r>
-    </w:p>
-    <w:p>
-      <w:pPr>
-        <w:sectPr>
-          <w:type w:val="nextPage"/>
-          <w:pgSz w:h="15840" w:w="12240" w:orient="portrait"/>
-          <w:pgMar w:bottom="864" w:top="864" w:left="864" w:right="864" w:header="720" w:footer="720"/>
-        </w:sectPr>
-      </w:pPr>
-    </w:p>
-    <w:p>
-      <w:pPr>
-        <w:spacing w:before="84" w:after="36" w:line="254" w:lineRule="auto"/>
-        <w:rPr/>
-      </w:pPr>
-      <w:r>
-        <w:rPr>
-          <w:rFonts w:ascii="Arial" w:cs="Arial" w:eastAsia="Arial" w:hAnsi="Arial"/>
-          <w:b w:val="1"/>
-          <w:bCs w:val="1"/>
-          <w:color w:val="c0392b"/>
-          <w:sz w:val="25"/>
-          <w:szCs w:val="25"/>
-          <w:rtl w:val="0"/>
-        </w:rPr>
-        <w:t xml:space="preserve">LEGISLATIVE PROCESS GLOSSARY</w:t>
+        <w:t xml:space="preserve">HB / SB / CACR / HR:</w:t>
+      </w:r>
+      <w:r>
+        <w:rPr>
+          <w:rFonts w:ascii="Arial" w:cs="Arial" w:eastAsia="Arial" w:hAnsi="Arial"/>
+          <w:color w:val="444444"/>
+          <w:sz w:val="20"/>
+          <w:szCs w:val="20"/>
+          <w:rtl w:val="0"/>
+        </w:rPr>
+        <w:t xml:space="preserve"> House Bill and Senate Bill (the chamber a bill started in, plus a number); CACR is a proposed constitutional amendment; HR is a House resolution, which expresses a position but is not law. Numbering restarts each biennium, so the same number in different years is usually a different bill.</w:t>
       </w:r>
     </w:p>
     <w:p>
@@ -5491,17 +5367,17 @@
           <w:szCs w:val="20"/>
           <w:rtl w:val="0"/>
         </w:rPr>
-        <w:t xml:space="preserve">HB / SB / CACR / HR:</w:t>
-      </w:r>
-      <w:r>
-        <w:rPr>
-          <w:rFonts w:ascii="Arial" w:cs="Arial" w:eastAsia="Arial" w:hAnsi="Arial"/>
-          <w:color w:val="444444"/>
-          <w:sz w:val="20"/>
-          <w:szCs w:val="20"/>
-          <w:rtl w:val="0"/>
-        </w:rPr>
-        <w:t xml:space="preserve"> House Bill and Senate Bill (the chamber a bill started in, plus a number); CACR is a proposed constitutional amendment; HR is a House resolution, which expresses a position but is not law. Numbering restarts each biennium, so the same number in different years is usually a different bill.</w:t>
+        <w:t xml:space="preserve">Chambers:</w:t>
+      </w:r>
+      <w:r>
+        <w:rPr>
+          <w:rFonts w:ascii="Arial" w:cs="Arial" w:eastAsia="Arial" w:hAnsi="Arial"/>
+          <w:color w:val="444444"/>
+          <w:sz w:val="20"/>
+          <w:szCs w:val="20"/>
+          <w:rtl w:val="0"/>
+        </w:rPr>
+        <w:t xml:space="preserve"> The 400-member House of Representatives and the 24-member Senate — the largest and one of the smallest state chambers in the country. A bill must pass both to reach the Governor.</w:t>
       </w:r>
     </w:p>
     <w:p>
@@ -5528,17 +5404,17 @@
           <w:szCs w:val="20"/>
           <w:rtl w:val="0"/>
         </w:rPr>
-        <w:t xml:space="preserve">Chambers:</w:t>
-      </w:r>
-      <w:r>
-        <w:rPr>
-          <w:rFonts w:ascii="Arial" w:cs="Arial" w:eastAsia="Arial" w:hAnsi="Arial"/>
-          <w:color w:val="444444"/>
-          <w:sz w:val="20"/>
-          <w:szCs w:val="20"/>
-          <w:rtl w:val="0"/>
-        </w:rPr>
-        <w:t xml:space="preserve"> The 400-member House of Representatives and the 24-member Senate — the largest and one of the smallest state chambers in the country. A bill must pass both to reach the Governor.</w:t>
+        <w:t xml:space="preserve">Session / biennium:</w:t>
+      </w:r>
+      <w:r>
+        <w:rPr>
+          <w:rFonts w:ascii="Arial" w:cs="Arial" w:eastAsia="Arial" w:hAnsi="Arial"/>
+          <w:color w:val="444444"/>
+          <w:sz w:val="20"/>
+          <w:szCs w:val="20"/>
+          <w:rtl w:val="0"/>
+        </w:rPr>
+        <w:t xml:space="preserve"> The Legislature meets every year, but bills live inside a two-year biennium (2021–22, 2023–24, 2025–26); a first-year bill can be carried into the second year under the same number.</w:t>
       </w:r>
     </w:p>
     <w:p>
@@ -5565,17 +5441,17 @@
           <w:szCs w:val="20"/>
           <w:rtl w:val="0"/>
         </w:rPr>
-        <w:t xml:space="preserve">Session / biennium:</w:t>
-      </w:r>
-      <w:r>
-        <w:rPr>
-          <w:rFonts w:ascii="Arial" w:cs="Arial" w:eastAsia="Arial" w:hAnsi="Arial"/>
-          <w:color w:val="444444"/>
-          <w:sz w:val="20"/>
-          <w:szCs w:val="20"/>
-          <w:rtl w:val="0"/>
-        </w:rPr>
-        <w:t xml:space="preserve"> The Legislature meets every year, but bills live inside a two-year biennium (2021–22, 2023–24, 2025–26); a first-year bill can be carried into the second year under the same number.</w:t>
+        <w:t xml:space="preserve">Budget trailer (HB2):</w:t>
+      </w:r>
+      <w:r>
+        <w:rPr>
+          <w:rFonts w:ascii="Arial" w:cs="Arial" w:eastAsia="Arial" w:hAnsi="Arial"/>
+          <w:color w:val="444444"/>
+          <w:sz w:val="20"/>
+          <w:szCs w:val="20"/>
+          <w:rtl w:val="0"/>
+        </w:rPr>
+        <w:t xml:space="preserve"> The omnibus policy bill that accompanies each two-year budget (HB1 carries the dollars). Dozens to hundreds of unrelated law changes ride in numbered sections — much of NH tax law is made here. Votes are on the whole trailer, never on one section.</w:t>
       </w:r>
     </w:p>
     <w:p>
@@ -5602,17 +5478,17 @@
           <w:szCs w:val="20"/>
           <w:rtl w:val="0"/>
         </w:rPr>
-        <w:t xml:space="preserve">Budget trailer (HB2):</w:t>
-      </w:r>
-      <w:r>
-        <w:rPr>
-          <w:rFonts w:ascii="Arial" w:cs="Arial" w:eastAsia="Arial" w:hAnsi="Arial"/>
-          <w:color w:val="444444"/>
-          <w:sz w:val="20"/>
-          <w:szCs w:val="20"/>
-          <w:rtl w:val="0"/>
-        </w:rPr>
-        <w:t xml:space="preserve"> The omnibus policy bill that accompanies each two-year budget (HB1 carries the dollars). Dozens to hundreds of unrelated law changes ride in numbered sections — much of NH tax law is made here. Votes are on the whole trailer, never on one section.</w:t>
+        <w:t xml:space="preserve">Chapter law:</w:t>
+      </w:r>
+      <w:r>
+        <w:rPr>
+          <w:rFonts w:ascii="Arial" w:cs="Arial" w:eastAsia="Arial" w:hAnsi="Arial"/>
+          <w:color w:val="444444"/>
+          <w:sz w:val="20"/>
+          <w:szCs w:val="20"/>
+          <w:rtl w:val="0"/>
+        </w:rPr>
+        <w:t xml:space="preserve"> A bill that becomes law is assigned a chapter number for its year — "Chapter 312" — the citation these documents use for enacted bills.</w:t>
       </w:r>
     </w:p>
     <w:p>
@@ -5639,17 +5515,17 @@
           <w:szCs w:val="20"/>
           <w:rtl w:val="0"/>
         </w:rPr>
-        <w:t xml:space="preserve">Chapter law:</w:t>
-      </w:r>
-      <w:r>
-        <w:rPr>
-          <w:rFonts w:ascii="Arial" w:cs="Arial" w:eastAsia="Arial" w:hAnsi="Arial"/>
-          <w:color w:val="444444"/>
-          <w:sz w:val="20"/>
-          <w:szCs w:val="20"/>
-          <w:rtl w:val="0"/>
-        </w:rPr>
-        <w:t xml:space="preserve"> A bill that becomes law is assigned a chapter number for its year — "Chapter 312" — the citation these documents use for enacted bills.</w:t>
+        <w:t xml:space="preserve">Committee report — Ought to Pass (OTP) / OTP with Amendment (OTPA) / Inexpedient to Legislate (ITL):</w:t>
+      </w:r>
+      <w:r>
+        <w:rPr>
+          <w:rFonts w:ascii="Arial" w:cs="Arial" w:eastAsia="Arial" w:hAnsi="Arial"/>
+          <w:color w:val="444444"/>
+          <w:sz w:val="20"/>
+          <w:szCs w:val="20"/>
+          <w:rtl w:val="0"/>
+        </w:rPr>
+        <w:t xml:space="preserve"> The committee's recommendation to the floor: pass, pass as changed, or kill. "Inexpedient to Legislate" adopted by either chamber is the standard way a New Hampshire bill dies.</w:t>
       </w:r>
     </w:p>
     <w:p>
@@ -5676,17 +5552,17 @@
           <w:szCs w:val="20"/>
           <w:rtl w:val="0"/>
         </w:rPr>
-        <w:t xml:space="preserve">Committee report — Ought to Pass (OTP) / OTP with Amendment (OTPA) / Inexpedient to Legislate (ITL):</w:t>
-      </w:r>
-      <w:r>
-        <w:rPr>
-          <w:rFonts w:ascii="Arial" w:cs="Arial" w:eastAsia="Arial" w:hAnsi="Arial"/>
-          <w:color w:val="444444"/>
-          <w:sz w:val="20"/>
-          <w:szCs w:val="20"/>
-          <w:rtl w:val="0"/>
-        </w:rPr>
-        <w:t xml:space="preserve"> The committee's recommendation to the floor: pass, pass as changed, or kill. "Inexpedient to Legislate" adopted by either chamber is the standard way a New Hampshire bill dies.</w:t>
+        <w:t xml:space="preserve">Consent calendar:</w:t>
+      </w:r>
+      <w:r>
+        <w:rPr>
+          <w:rFonts w:ascii="Arial" w:cs="Arial" w:eastAsia="Arial" w:hAnsi="Arial"/>
+          <w:color w:val="444444"/>
+          <w:sz w:val="20"/>
+          <w:szCs w:val="20"/>
+          <w:rtl w:val="0"/>
+        </w:rPr>
+        <w:t xml:space="preserve"> A batch of uncontested committee recommendations approved in one voice vote; many bills die (or pass) this way without an individual vote.</w:t>
       </w:r>
     </w:p>
     <w:p>
@@ -5713,17 +5589,17 @@
           <w:szCs w:val="20"/>
           <w:rtl w:val="0"/>
         </w:rPr>
-        <w:t xml:space="preserve">Consent calendar:</w:t>
-      </w:r>
-      <w:r>
-        <w:rPr>
-          <w:rFonts w:ascii="Arial" w:cs="Arial" w:eastAsia="Arial" w:hAnsi="Arial"/>
-          <w:color w:val="444444"/>
-          <w:sz w:val="20"/>
-          <w:szCs w:val="20"/>
-          <w:rtl w:val="0"/>
-        </w:rPr>
-        <w:t xml:space="preserve"> A batch of uncontested committee recommendations approved in one voice vote; many bills die (or pass) this way without an individual vote.</w:t>
+        <w:t xml:space="preserve">Roll call / division / voice vote:</w:t>
+      </w:r>
+      <w:r>
+        <w:rPr>
+          <w:rFonts w:ascii="Arial" w:cs="Arial" w:eastAsia="Arial" w:hAnsi="Arial"/>
+          <w:color w:val="444444"/>
+          <w:sz w:val="20"/>
+          <w:szCs w:val="20"/>
+          <w:rtl w:val="0"/>
+        </w:rPr>
+        <w:t xml:space="preserve"> A roll call records each member's vote by name; a division counts votes without names; a voice vote records nothing. Many decisive outcomes in these documents happened on division or voice votes, which is why they carry no member-level tallies.</w:t>
       </w:r>
     </w:p>
     <w:p>
@@ -5750,17 +5626,17 @@
           <w:szCs w:val="20"/>
           <w:rtl w:val="0"/>
         </w:rPr>
-        <w:t xml:space="preserve">Roll call / division / voice vote:</w:t>
-      </w:r>
-      <w:r>
-        <w:rPr>
-          <w:rFonts w:ascii="Arial" w:cs="Arial" w:eastAsia="Arial" w:hAnsi="Arial"/>
-          <w:color w:val="444444"/>
-          <w:sz w:val="20"/>
-          <w:szCs w:val="20"/>
-          <w:rtl w:val="0"/>
-        </w:rPr>
-        <w:t xml:space="preserve"> A roll call records each member's vote by name; a division counts votes without names; a voice vote records nothing. Many decisive outcomes in these documents happened on division or voice votes, which is why they carry no member-level tallies.</w:t>
+        <w:t xml:space="preserve">Laid on the table:</w:t>
+      </w:r>
+      <w:r>
+        <w:rPr>
+          <w:rFonts w:ascii="Arial" w:cs="Arial" w:eastAsia="Arial" w:hAnsi="Arial"/>
+          <w:color w:val="444444"/>
+          <w:sz w:val="20"/>
+          <w:szCs w:val="20"/>
+          <w:rtl w:val="0"/>
+        </w:rPr>
+        <w:t xml:space="preserve"> A motion that sets a bill aside; unless a later motion removes it, the bill dies there at the session's end.</w:t>
       </w:r>
     </w:p>
     <w:p>
@@ -5787,17 +5663,17 @@
           <w:szCs w:val="20"/>
           <w:rtl w:val="0"/>
         </w:rPr>
-        <w:t xml:space="preserve">Laid on the table:</w:t>
-      </w:r>
-      <w:r>
-        <w:rPr>
-          <w:rFonts w:ascii="Arial" w:cs="Arial" w:eastAsia="Arial" w:hAnsi="Arial"/>
-          <w:color w:val="444444"/>
-          <w:sz w:val="20"/>
-          <w:szCs w:val="20"/>
-          <w:rtl w:val="0"/>
-        </w:rPr>
-        <w:t xml:space="preserve"> A motion that sets a bill aside; unless a later motion removes it, the bill dies there at the session's end.</w:t>
+        <w:t xml:space="preserve">Interim study:</w:t>
+      </w:r>
+      <w:r>
+        <w:rPr>
+          <w:rFonts w:ascii="Arial" w:cs="Arial" w:eastAsia="Arial" w:hAnsi="Arial"/>
+          <w:color w:val="444444"/>
+          <w:sz w:val="20"/>
+          <w:szCs w:val="20"/>
+          <w:rtl w:val="0"/>
+        </w:rPr>
+        <w:t xml:space="preserve"> A committee keeps the bill for study between sessions instead of passing or killing it; the bill itself is dead, but the idea may return with a recommendation.</w:t>
       </w:r>
     </w:p>
     <w:p>
@@ -5824,17 +5700,17 @@
           <w:szCs w:val="20"/>
           <w:rtl w:val="0"/>
         </w:rPr>
-        <w:t xml:space="preserve">Interim study:</w:t>
-      </w:r>
-      <w:r>
-        <w:rPr>
-          <w:rFonts w:ascii="Arial" w:cs="Arial" w:eastAsia="Arial" w:hAnsi="Arial"/>
-          <w:color w:val="444444"/>
-          <w:sz w:val="20"/>
-          <w:szCs w:val="20"/>
-          <w:rtl w:val="0"/>
-        </w:rPr>
-        <w:t xml:space="preserve"> A committee keeps the bill for study between sessions instead of passing or killing it; the bill itself is dead, but the idea may return with a recommendation.</w:t>
+        <w:t xml:space="preserve">Retained / rereferred:</w:t>
+      </w:r>
+      <w:r>
+        <w:rPr>
+          <w:rFonts w:ascii="Arial" w:cs="Arial" w:eastAsia="Arial" w:hAnsi="Arial"/>
+          <w:color w:val="444444"/>
+          <w:sz w:val="20"/>
+          <w:szCs w:val="20"/>
+          <w:rtl w:val="0"/>
+        </w:rPr>
+        <w:t xml:space="preserve"> The House retains, the Senate rereferrs — the committee keeps a first-year bill over the summer and acts on it in the second year of the biennium.</w:t>
       </w:r>
     </w:p>
     <w:p>
@@ -5861,17 +5737,17 @@
           <w:szCs w:val="20"/>
           <w:rtl w:val="0"/>
         </w:rPr>
-        <w:t xml:space="preserve">Retained / rereferred:</w:t>
-      </w:r>
-      <w:r>
-        <w:rPr>
-          <w:rFonts w:ascii="Arial" w:cs="Arial" w:eastAsia="Arial" w:hAnsi="Arial"/>
-          <w:color w:val="444444"/>
-          <w:sz w:val="20"/>
-          <w:szCs w:val="20"/>
-          <w:rtl w:val="0"/>
-        </w:rPr>
-        <w:t xml:space="preserve"> The House retains, the Senate rereferrs — the committee keeps a first-year bill over the summer and acts on it in the second year of the biennium.</w:t>
+        <w:t xml:space="preserve">Committee of conference:</w:t>
+      </w:r>
+      <w:r>
+        <w:rPr>
+          <w:rFonts w:ascii="Arial" w:cs="Arial" w:eastAsia="Arial" w:hAnsi="Arial"/>
+          <w:color w:val="444444"/>
+          <w:sz w:val="20"/>
+          <w:szCs w:val="20"/>
+          <w:rtl w:val="0"/>
+        </w:rPr>
+        <w:t xml:space="preserve"> Negotiators from both chambers reconcile differing versions; if they cannot agree, or a chamber rejects the report, the bill dies "between the chambers."</w:t>
       </w:r>
     </w:p>
     <w:p>
@@ -5898,17 +5774,17 @@
           <w:szCs w:val="20"/>
           <w:rtl w:val="0"/>
         </w:rPr>
-        <w:t xml:space="preserve">Committee of conference:</w:t>
-      </w:r>
-      <w:r>
-        <w:rPr>
-          <w:rFonts w:ascii="Arial" w:cs="Arial" w:eastAsia="Arial" w:hAnsi="Arial"/>
-          <w:color w:val="444444"/>
-          <w:sz w:val="20"/>
-          <w:szCs w:val="20"/>
-          <w:rtl w:val="0"/>
-        </w:rPr>
-        <w:t xml:space="preserve"> Negotiators from both chambers reconcile differing versions; if they cannot agree, or a chamber rejects the report, the bill dies "between the chambers."</w:t>
+        <w:t xml:space="preserve">Concur / nonconcur:</w:t>
+      </w:r>
+      <w:r>
+        <w:rPr>
+          <w:rFonts w:ascii="Arial" w:cs="Arial" w:eastAsia="Arial" w:hAnsi="Arial"/>
+          <w:color w:val="444444"/>
+          <w:sz w:val="20"/>
+          <w:szCs w:val="20"/>
+          <w:rtl w:val="0"/>
+        </w:rPr>
+        <w:t xml:space="preserve"> When the second chamber amends a bill, the first chamber must accept (concur in) the change, ask for a conference, or let the bill die.</w:t>
       </w:r>
     </w:p>
     <w:p>
@@ -5935,17 +5811,17 @@
           <w:szCs w:val="20"/>
           <w:rtl w:val="0"/>
         </w:rPr>
-        <w:t xml:space="preserve">Concur / nonconcur:</w:t>
-      </w:r>
-      <w:r>
-        <w:rPr>
-          <w:rFonts w:ascii="Arial" w:cs="Arial" w:eastAsia="Arial" w:hAnsi="Arial"/>
-          <w:color w:val="444444"/>
-          <w:sz w:val="20"/>
-          <w:szCs w:val="20"/>
-          <w:rtl w:val="0"/>
-        </w:rPr>
-        <w:t xml:space="preserve"> When the second chamber amends a bill, the first chamber must accept (concur in) the change, ask for a conference, or let the bill die.</w:t>
+        <w:t xml:space="preserve">Senate Rule 3-23 deadline:</w:t>
+      </w:r>
+      <w:r>
+        <w:rPr>
+          <w:rFonts w:ascii="Arial" w:cs="Arial" w:eastAsia="Arial" w:hAnsi="Arial"/>
+          <w:color w:val="444444"/>
+          <w:sz w:val="20"/>
+          <w:szCs w:val="20"/>
+          <w:rtl w:val="0"/>
+        </w:rPr>
+        <w:t xml:space="preserve"> The Senate's internal end-of-year deadline; bills still pending are automatically declared Inexpedient to Legislate — several tax and municipal-aid bills died this way after unanimous votes.</w:t>
       </w:r>
     </w:p>
     <w:p>
@@ -5972,17 +5848,17 @@
           <w:szCs w:val="20"/>
           <w:rtl w:val="0"/>
         </w:rPr>
-        <w:t xml:space="preserve">Senate Rule 3-23 deadline:</w:t>
-      </w:r>
-      <w:r>
-        <w:rPr>
-          <w:rFonts w:ascii="Arial" w:cs="Arial" w:eastAsia="Arial" w:hAnsi="Arial"/>
-          <w:color w:val="444444"/>
-          <w:sz w:val="20"/>
-          <w:szCs w:val="20"/>
-          <w:rtl w:val="0"/>
-        </w:rPr>
-        <w:t xml:space="preserve"> The Senate's internal end-of-year deadline; bills still pending are automatically declared Inexpedient to Legislate — several tax and municipal-aid bills died this way after unanimous votes.</w:t>
+        <w:t xml:space="preserve">Governor and Executive Council:</w:t>
+      </w:r>
+      <w:r>
+        <w:rPr>
+          <w:rFonts w:ascii="Arial" w:cs="Arial" w:eastAsia="Arial" w:hAnsi="Arial"/>
+          <w:color w:val="444444"/>
+          <w:sz w:val="20"/>
+          <w:szCs w:val="20"/>
+          <w:rtl w:val="0"/>
+        </w:rPr>
+        <w:t xml:space="preserve"> The Governor signs or vetoes bills; the elected five-member Executive Council confirms appointments — including the tax officials and board members these documents mention.</w:t>
       </w:r>
     </w:p>
     <w:p>
@@ -6009,17 +5885,17 @@
           <w:szCs w:val="20"/>
           <w:rtl w:val="0"/>
         </w:rPr>
-        <w:t xml:space="preserve">Governor and Executive Council:</w:t>
-      </w:r>
-      <w:r>
-        <w:rPr>
-          <w:rFonts w:ascii="Arial" w:cs="Arial" w:eastAsia="Arial" w:hAnsi="Arial"/>
-          <w:color w:val="444444"/>
-          <w:sz w:val="20"/>
-          <w:szCs w:val="20"/>
-          <w:rtl w:val="0"/>
-        </w:rPr>
-        <w:t xml:space="preserve"> The Governor signs or vetoes bills; the elected five-member Executive Council confirms appointments — including the tax officials and board members these documents mention.</w:t>
+        <w:t xml:space="preserve">Veto / override:</w:t>
+      </w:r>
+      <w:r>
+        <w:rPr>
+          <w:rFonts w:ascii="Arial" w:cs="Arial" w:eastAsia="Arial" w:hAnsi="Arial"/>
+          <w:color w:val="444444"/>
+          <w:sz w:val="20"/>
+          <w:szCs w:val="20"/>
+          <w:rtl w:val="0"/>
+        </w:rPr>
+        <w:t xml:space="preserve"> The Governor's rejection of a passed bill; overriding takes two-thirds of each chamber. Four tax bills were vetoed in this record, and no override succeeded.</w:t>
       </w:r>
     </w:p>
     <w:p>
@@ -6046,17 +5922,17 @@
           <w:szCs w:val="20"/>
           <w:rtl w:val="0"/>
         </w:rPr>
-        <w:t xml:space="preserve">Veto / override:</w:t>
-      </w:r>
-      <w:r>
-        <w:rPr>
-          <w:rFonts w:ascii="Arial" w:cs="Arial" w:eastAsia="Arial" w:hAnsi="Arial"/>
-          <w:color w:val="444444"/>
-          <w:sz w:val="20"/>
-          <w:szCs w:val="20"/>
-          <w:rtl w:val="0"/>
-        </w:rPr>
-        <w:t xml:space="preserve"> The Governor's rejection of a passed bill; overriding takes two-thirds of each chamber. Four tax bills were vetoed in this record, and no override succeeded.</w:t>
+        <w:t xml:space="preserve">Sponsor / prime sponsor:</w:t>
+      </w:r>
+      <w:r>
+        <w:rPr>
+          <w:rFonts w:ascii="Arial" w:cs="Arial" w:eastAsia="Arial" w:hAnsi="Arial"/>
+          <w:color w:val="444444"/>
+          <w:sz w:val="20"/>
+          <w:szCs w:val="20"/>
+          <w:rtl w:val="0"/>
+        </w:rPr>
+        <w:t xml:space="preserve"> The lawmakers who formally introduce a bill; the prime sponsor is its lead author. Cross-party sponsor teams appear throughout the relief and transparency records.</w:t>
       </w:r>
     </w:p>
     <w:p>
@@ -6072,32 +5948,6 @@
           <w:sz w:val="10"/>
           <w:szCs w:val="10"/>
         </w:rPr>
-      </w:pPr>
-      <w:r>
-        <w:rPr>
-          <w:rFonts w:ascii="Arial" w:cs="Arial" w:eastAsia="Arial" w:hAnsi="Arial"/>
-          <w:b w:val="1"/>
-          <w:bCs w:val="1"/>
-          <w:color w:val="1a2d4f"/>
-          <w:sz w:val="20"/>
-          <w:szCs w:val="20"/>
-          <w:rtl w:val="0"/>
-        </w:rPr>
-        <w:t xml:space="preserve">Sponsor / prime sponsor:</w:t>
-      </w:r>
-      <w:r>
-        <w:rPr>
-          <w:rFonts w:ascii="Arial" w:cs="Arial" w:eastAsia="Arial" w:hAnsi="Arial"/>
-          <w:color w:val="444444"/>
-          <w:sz w:val="20"/>
-          <w:szCs w:val="20"/>
-          <w:rtl w:val="0"/>
-        </w:rPr>
-        <w:t xml:space="preserve"> The lawmakers who formally introduce a bill; the prime sponsor is its lead author. Cross-party sponsor teams appear throughout the relief and transparency records.</w:t>
-      </w:r>
-    </w:p>
-    <w:p>
-      <w:pPr>
         <w:sectPr>
           <w:type w:val="continuous"/>
           <w:pgSz w:h="15840" w:w="12240" w:orient="portrait"/>
@@ -6107,21 +5957,6 @@
             <w:col w:space="0" w:w="5135.999999999999"/>
           </w:cols>
         </w:sectPr>
-      </w:pPr>
-    </w:p>
-    <w:p>
-      <w:pPr>
-        <w:numPr>
-          <w:ilvl w:val="0"/>
-          <w:numId w:val="2"/>
-        </w:numPr>
-        <w:spacing w:after="0" w:afterAutospacing="0" w:line="276" w:lineRule="auto"/>
-        <w:ind w:left="720" w:hanging="360"/>
-        <w:rPr>
-          <w:rFonts w:ascii="Arial" w:cs="Arial" w:eastAsia="Arial" w:hAnsi="Arial"/>
-          <w:sz w:val="10"/>
-          <w:szCs w:val="10"/>
-        </w:rPr>
       </w:pPr>
       <w:r>
         <w:rPr>

</xml_diff>